<commit_message>
Added Brgy in MapView and Added About page
</commit_message>
<xml_diff>
--- a/wastewatch/frontend/public/Current Notice of BOT meeting.docx
+++ b/wastewatch/frontend/public/Current Notice of BOT meeting.docx
@@ -14,8 +14,6 @@
           <w14:ligatures w14:val="none"/>
         </w:rPr>
       </w:pPr>
-      <w:bookmarkStart w:id="0" w:name="_GoBack"/>
-      <w:bookmarkEnd w:id="0"/>
     </w:p>
     <w:p>
       <w:pPr>
@@ -607,7 +605,29 @@
           <w:lang w:val="en-US"/>
           <w14:ligatures w14:val="none"/>
         </w:rPr>
-        <w:t>Budget for Commencement Rights 2026</w:t>
+        <w:t xml:space="preserve">Budget for Commencement </w:t>
+      </w:r>
+      <w:r>
+        <w:rPr>
+          <w:rFonts w:ascii="Times New Roman" w:eastAsia="Times New Roman" w:hAnsi="Times New Roman" w:cs="Times New Roman"/>
+          <w:kern w:val="0"/>
+          <w:sz w:val="28"/>
+          <w:szCs w:val="28"/>
+          <w:lang w:val="en-US"/>
+          <w14:ligatures w14:val="none"/>
+        </w:rPr>
+        <w:t>Rites</w:t>
+      </w:r>
+      <w:r>
+        <w:rPr>
+          <w:rFonts w:ascii="Times New Roman" w:eastAsia="Times New Roman" w:hAnsi="Times New Roman" w:cs="Times New Roman"/>
+          <w:kern w:val="0"/>
+          <w:sz w:val="28"/>
+          <w:szCs w:val="28"/>
+          <w:lang w:val="en-US"/>
+          <w14:ligatures w14:val="none"/>
+        </w:rPr>
+        <w:t xml:space="preserve"> 2026</w:t>
       </w:r>
     </w:p>
     <w:p>
@@ -646,639 +666,8 @@
           <w:lang w:val="en-US"/>
           <w14:ligatures w14:val="none"/>
         </w:rPr>
-        <w:t xml:space="preserve"> (Board Chairman’s Time)</w:t>
-      </w:r>
-    </w:p>
-    <w:p>
-      <w:pPr>
-        <w:spacing w:after="0" w:line="240" w:lineRule="auto"/>
-        <w:rPr>
-          <w:rFonts w:ascii="Times New Roman" w:eastAsia="Times New Roman" w:hAnsi="Times New Roman" w:cs="Times New Roman"/>
-          <w:kern w:val="0"/>
-          <w:sz w:val="28"/>
-          <w:szCs w:val="28"/>
-          <w:lang w:val="en-US"/>
-          <w14:ligatures w14:val="none"/>
-        </w:rPr>
-      </w:pPr>
-    </w:p>
-    <w:p>
-      <w:pPr>
-        <w:spacing w:after="0" w:line="240" w:lineRule="auto"/>
-        <w:rPr>
-          <w:rFonts w:ascii="Times New Roman" w:eastAsia="Times New Roman" w:hAnsi="Times New Roman" w:cs="Times New Roman"/>
-          <w:kern w:val="0"/>
-          <w:sz w:val="28"/>
-          <w:szCs w:val="28"/>
-          <w:lang w:val="en-US"/>
-          <w14:ligatures w14:val="none"/>
-        </w:rPr>
-      </w:pPr>
-      <w:r>
-        <w:rPr>
-          <w:rFonts w:ascii="Times New Roman" w:eastAsia="Times New Roman" w:hAnsi="Times New Roman" w:cs="Times New Roman"/>
-          <w:kern w:val="0"/>
-          <w:sz w:val="28"/>
-          <w:szCs w:val="28"/>
-          <w:lang w:val="en-US"/>
-          <w14:ligatures w14:val="none"/>
-        </w:rPr>
-        <w:t>We highly appreciate your personal presence in the said meeting. Thank you very much.</w:t>
-      </w:r>
-    </w:p>
-    <w:p>
-      <w:pPr>
-        <w:spacing w:after="0" w:line="240" w:lineRule="auto"/>
-        <w:rPr>
-          <w:rFonts w:ascii="Times New Roman" w:eastAsia="Times New Roman" w:hAnsi="Times New Roman" w:cs="Times New Roman"/>
-          <w:kern w:val="0"/>
-          <w:sz w:val="28"/>
-          <w:szCs w:val="28"/>
-          <w:lang w:val="en-US"/>
-          <w14:ligatures w14:val="none"/>
-        </w:rPr>
-      </w:pPr>
-    </w:p>
-    <w:p>
-      <w:pPr>
-        <w:spacing w:after="0" w:line="240" w:lineRule="auto"/>
-        <w:rPr>
-          <w:rFonts w:ascii="Times New Roman" w:eastAsia="Times New Roman" w:hAnsi="Times New Roman" w:cs="Times New Roman"/>
-          <w:kern w:val="0"/>
-          <w:sz w:val="28"/>
-          <w:szCs w:val="28"/>
-          <w:lang w:val="en-US"/>
-          <w14:ligatures w14:val="none"/>
-        </w:rPr>
-      </w:pPr>
-      <w:r>
-        <w:rPr>
-          <w:rFonts w:ascii="Times New Roman" w:eastAsia="Times New Roman" w:hAnsi="Times New Roman" w:cs="Times New Roman"/>
-          <w:kern w:val="0"/>
-          <w:sz w:val="28"/>
-          <w:szCs w:val="28"/>
-          <w:lang w:val="en-US"/>
-          <w14:ligatures w14:val="none"/>
-        </w:rPr>
-        <w:t>Very truly yours,</w:t>
-      </w:r>
-    </w:p>
-    <w:p>
-      <w:pPr>
-        <w:spacing w:after="0" w:line="240" w:lineRule="auto"/>
-        <w:rPr>
-          <w:rFonts w:ascii="Times New Roman" w:eastAsia="Times New Roman" w:hAnsi="Times New Roman" w:cs="Times New Roman"/>
-          <w:kern w:val="0"/>
-          <w:sz w:val="28"/>
-          <w:szCs w:val="28"/>
-          <w:lang w:val="en-US"/>
-          <w14:ligatures w14:val="none"/>
-        </w:rPr>
-      </w:pPr>
-    </w:p>
-    <w:p>
-      <w:pPr>
-        <w:spacing w:after="0" w:line="240" w:lineRule="auto"/>
-        <w:rPr>
-          <w:rFonts w:ascii="Times New Roman" w:eastAsia="Times New Roman" w:hAnsi="Times New Roman" w:cs="Times New Roman"/>
-          <w:kern w:val="0"/>
-          <w:sz w:val="28"/>
-          <w:szCs w:val="28"/>
-          <w:lang w:val="en-US"/>
-          <w14:ligatures w14:val="none"/>
-        </w:rPr>
-      </w:pPr>
-    </w:p>
-    <w:p>
-      <w:pPr>
-        <w:spacing w:after="0" w:line="240" w:lineRule="auto"/>
-        <w:rPr>
-          <w:rFonts w:ascii="Times New Roman" w:eastAsia="Times New Roman" w:hAnsi="Times New Roman" w:cs="Times New Roman"/>
-          <w:kern w:val="0"/>
-          <w:sz w:val="28"/>
-          <w:szCs w:val="28"/>
-          <w:lang w:val="en-US"/>
-          <w14:ligatures w14:val="none"/>
-        </w:rPr>
-      </w:pPr>
-    </w:p>
-    <w:p>
-      <w:pPr>
-        <w:spacing w:after="0" w:line="240" w:lineRule="auto"/>
-        <w:rPr>
-          <w:rFonts w:ascii="Times New Roman" w:eastAsia="Times New Roman" w:hAnsi="Times New Roman" w:cs="Times New Roman"/>
-          <w:b/>
-          <w:kern w:val="0"/>
-          <w:sz w:val="28"/>
-          <w:szCs w:val="28"/>
-          <w:lang w:val="en-US"/>
-          <w14:ligatures w14:val="none"/>
-        </w:rPr>
-      </w:pPr>
-      <w:r>
-        <w:rPr>
-          <w:rFonts w:ascii="Times New Roman" w:eastAsia="Times New Roman" w:hAnsi="Times New Roman" w:cs="Times New Roman"/>
-          <w:b/>
-          <w:kern w:val="0"/>
-          <w:sz w:val="28"/>
-          <w:szCs w:val="28"/>
-          <w:lang w:val="en-US"/>
-          <w14:ligatures w14:val="none"/>
-        </w:rPr>
-        <w:t xml:space="preserve">Hon. MARK DON VICTOR B. ALCALA </w:t>
-      </w:r>
-    </w:p>
-    <w:p>
-      <w:pPr>
-        <w:spacing w:after="0" w:line="240" w:lineRule="auto"/>
-        <w:rPr>
-          <w:rFonts w:ascii="Times New Roman" w:eastAsia="Times New Roman" w:hAnsi="Times New Roman" w:cs="Times New Roman"/>
-          <w:kern w:val="0"/>
-          <w:sz w:val="28"/>
-          <w:szCs w:val="28"/>
-          <w:lang w:val="en-US"/>
-          <w14:ligatures w14:val="none"/>
-        </w:rPr>
-      </w:pPr>
-      <w:r>
-        <w:rPr>
-          <w:rFonts w:ascii="Times New Roman" w:eastAsia="Times New Roman" w:hAnsi="Times New Roman" w:cs="Times New Roman"/>
-          <w:kern w:val="0"/>
-          <w:sz w:val="28"/>
-          <w:szCs w:val="28"/>
-          <w:lang w:val="en-US"/>
-          <w14:ligatures w14:val="none"/>
-        </w:rPr>
-        <w:t>Chairman, Board of Trustees</w:t>
-      </w:r>
-    </w:p>
-    <w:p>
-      <w:pPr>
-        <w:spacing w:after="0" w:line="240" w:lineRule="auto"/>
-        <w:rPr>
-          <w:rFonts w:ascii="Times New Roman" w:eastAsia="Times New Roman" w:hAnsi="Times New Roman" w:cs="Times New Roman"/>
-          <w:kern w:val="0"/>
-          <w:sz w:val="28"/>
-          <w:szCs w:val="28"/>
-          <w:lang w:val="en-US"/>
-          <w14:ligatures w14:val="none"/>
-        </w:rPr>
-      </w:pPr>
-    </w:p>
-    <w:p>
-      <w:pPr>
-        <w:spacing w:after="0" w:line="240" w:lineRule="auto"/>
-        <w:rPr>
-          <w:rFonts w:ascii="Times New Roman" w:eastAsia="Times New Roman" w:hAnsi="Times New Roman" w:cs="Times New Roman"/>
-          <w:kern w:val="0"/>
-          <w:sz w:val="28"/>
-          <w:szCs w:val="28"/>
-          <w:lang w:val="en-US"/>
-          <w14:ligatures w14:val="none"/>
-        </w:rPr>
-      </w:pPr>
-    </w:p>
-    <w:p>
-      <w:pPr>
-        <w:spacing w:after="0" w:line="240" w:lineRule="auto"/>
-        <w:rPr>
-          <w:rFonts w:ascii="Times New Roman" w:eastAsia="Times New Roman" w:hAnsi="Times New Roman" w:cs="Times New Roman"/>
-          <w:kern w:val="0"/>
-          <w:sz w:val="28"/>
-          <w:szCs w:val="28"/>
-          <w:lang w:val="en-US"/>
-          <w14:ligatures w14:val="none"/>
-        </w:rPr>
-      </w:pPr>
-    </w:p>
-    <w:p>
-      <w:pPr>
-        <w:rPr>
-          <w:rFonts w:ascii="Times New Roman" w:hAnsi="Times New Roman" w:cs="Times New Roman"/>
-        </w:rPr>
-      </w:pPr>
-    </w:p>
-    <w:p>
-      <w:pPr>
-        <w:rPr>
-          <w:rFonts w:ascii="Times New Roman" w:hAnsi="Times New Roman" w:cs="Times New Roman"/>
-        </w:rPr>
-      </w:pPr>
-    </w:p>
-    <w:p>
-      <w:pPr>
-        <w:rPr>
-          <w:rFonts w:ascii="Times New Roman" w:hAnsi="Times New Roman" w:cs="Times New Roman"/>
-        </w:rPr>
-      </w:pPr>
-    </w:p>
-    <w:p>
-      <w:pPr>
-        <w:rPr>
-          <w:rFonts w:ascii="Times New Roman" w:hAnsi="Times New Roman" w:cs="Times New Roman"/>
-        </w:rPr>
-      </w:pPr>
-      <w:r>
-        <w:rPr>
-          <w:rFonts w:ascii="Times New Roman" w:hAnsi="Times New Roman" w:cs="Times New Roman"/>
-        </w:rPr>
-        <w:br w:type="page"/>
-      </w:r>
-    </w:p>
-    <w:p>
-      <w:pPr>
-        <w:spacing w:after="0" w:line="240" w:lineRule="auto"/>
-        <w:rPr>
-          <w:rFonts w:ascii="Times New Roman" w:eastAsia="Times New Roman" w:hAnsi="Times New Roman" w:cs="Times New Roman"/>
-          <w:kern w:val="0"/>
-          <w:sz w:val="28"/>
-          <w:szCs w:val="28"/>
-          <w:lang w:val="en-US"/>
-          <w14:ligatures w14:val="none"/>
-        </w:rPr>
-      </w:pPr>
-    </w:p>
-    <w:p>
-      <w:pPr>
-        <w:spacing w:after="0" w:line="240" w:lineRule="auto"/>
-        <w:rPr>
-          <w:rFonts w:ascii="Times New Roman" w:eastAsia="Times New Roman" w:hAnsi="Times New Roman" w:cs="Times New Roman"/>
-          <w:kern w:val="0"/>
-          <w:sz w:val="28"/>
-          <w:szCs w:val="28"/>
-          <w:lang w:val="en-US"/>
-          <w14:ligatures w14:val="none"/>
-        </w:rPr>
-      </w:pPr>
-      <w:r>
-        <w:rPr>
-          <w:rFonts w:ascii="Times New Roman" w:eastAsia="Times New Roman" w:hAnsi="Times New Roman" w:cs="Times New Roman"/>
-          <w:kern w:val="0"/>
-          <w:sz w:val="28"/>
-          <w:szCs w:val="28"/>
-          <w:lang w:val="en-US"/>
-          <w14:ligatures w14:val="none"/>
-        </w:rPr>
-        <w:t>May 14, 2026</w:t>
-      </w:r>
-    </w:p>
-    <w:p>
-      <w:pPr>
-        <w:tabs>
-          <w:tab w:val="left" w:pos="1440"/>
-        </w:tabs>
-        <w:spacing w:after="0" w:line="240" w:lineRule="auto"/>
-        <w:rPr>
-          <w:rFonts w:ascii="Times New Roman" w:eastAsia="Times New Roman" w:hAnsi="Times New Roman" w:cs="Times New Roman"/>
-          <w:kern w:val="0"/>
-          <w:sz w:val="28"/>
-          <w:szCs w:val="28"/>
-          <w:lang w:val="en-US"/>
-          <w14:ligatures w14:val="none"/>
-        </w:rPr>
-      </w:pPr>
-      <w:r>
-        <w:rPr>
-          <w:rFonts w:ascii="Times New Roman" w:eastAsia="Times New Roman" w:hAnsi="Times New Roman" w:cs="Times New Roman"/>
-          <w:kern w:val="0"/>
-          <w:sz w:val="28"/>
-          <w:szCs w:val="28"/>
-          <w:lang w:val="en-US"/>
-          <w14:ligatures w14:val="none"/>
-        </w:rPr>
-        <w:tab/>
-      </w:r>
-    </w:p>
-    <w:p>
-      <w:pPr>
-        <w:spacing w:after="0"/>
-        <w:rPr>
-          <w:rFonts w:ascii="Times New Roman" w:hAnsi="Times New Roman" w:cs="Times New Roman"/>
-          <w:b/>
-          <w:sz w:val="28"/>
-          <w:szCs w:val="28"/>
-        </w:rPr>
-      </w:pPr>
-      <w:r>
-        <w:rPr>
-          <w:rFonts w:ascii="Times New Roman" w:hAnsi="Times New Roman" w:cs="Times New Roman"/>
-          <w:b/>
-          <w:sz w:val="28"/>
-          <w:szCs w:val="28"/>
-        </w:rPr>
-        <w:t>Mr. Gaspar K. Ong</w:t>
-      </w:r>
-    </w:p>
-    <w:p>
-      <w:pPr>
-        <w:spacing w:after="0"/>
-        <w:rPr>
-          <w:rFonts w:ascii="Times New Roman" w:hAnsi="Times New Roman" w:cs="Times New Roman"/>
-          <w:sz w:val="28"/>
-          <w:szCs w:val="28"/>
-        </w:rPr>
-      </w:pPr>
-      <w:r>
-        <w:rPr>
-          <w:rFonts w:ascii="Times New Roman" w:hAnsi="Times New Roman" w:cs="Times New Roman"/>
-          <w:sz w:val="28"/>
-          <w:szCs w:val="28"/>
-        </w:rPr>
-        <w:t>Member</w:t>
-      </w:r>
-    </w:p>
-    <w:p>
-      <w:pPr>
-        <w:rPr>
-          <w:rFonts w:ascii="Times New Roman" w:hAnsi="Times New Roman" w:cs="Times New Roman"/>
-          <w:b/>
-          <w:sz w:val="28"/>
-          <w:szCs w:val="28"/>
-        </w:rPr>
-      </w:pPr>
-    </w:p>
-    <w:p>
-      <w:pPr>
-        <w:rPr>
-          <w:rFonts w:ascii="Times New Roman" w:hAnsi="Times New Roman" w:cs="Times New Roman"/>
-          <w:b/>
-          <w:sz w:val="28"/>
-          <w:szCs w:val="28"/>
-        </w:rPr>
-      </w:pPr>
-      <w:r>
-        <w:rPr>
-          <w:rFonts w:ascii="Times New Roman" w:hAnsi="Times New Roman" w:cs="Times New Roman"/>
-          <w:b/>
-          <w:sz w:val="28"/>
-          <w:szCs w:val="28"/>
-        </w:rPr>
-        <w:t>Dear Mr. Ong:</w:t>
-      </w:r>
-    </w:p>
-    <w:p>
-      <w:pPr>
-        <w:spacing w:after="0" w:line="240" w:lineRule="auto"/>
-        <w:rPr>
-          <w:rFonts w:ascii="Times New Roman" w:eastAsia="Times New Roman" w:hAnsi="Times New Roman" w:cs="Times New Roman"/>
-          <w:kern w:val="0"/>
-          <w:sz w:val="28"/>
-          <w:szCs w:val="28"/>
-          <w:lang w:val="en-US"/>
-          <w14:ligatures w14:val="none"/>
-        </w:rPr>
-      </w:pPr>
-    </w:p>
-    <w:p>
-      <w:pPr>
-        <w:spacing w:after="0" w:line="240" w:lineRule="auto"/>
-        <w:jc w:val="both"/>
-        <w:rPr>
-          <w:rFonts w:ascii="Times New Roman" w:eastAsia="Times New Roman" w:hAnsi="Times New Roman" w:cs="Times New Roman"/>
-          <w:b/>
-          <w:kern w:val="0"/>
-          <w:sz w:val="28"/>
-          <w:szCs w:val="28"/>
-          <w:lang w:val="en-US"/>
-          <w14:ligatures w14:val="none"/>
-        </w:rPr>
-      </w:pPr>
-      <w:r>
-        <w:rPr>
-          <w:rFonts w:ascii="Times New Roman" w:eastAsia="Times New Roman" w:hAnsi="Times New Roman" w:cs="Times New Roman"/>
-          <w:kern w:val="0"/>
-          <w:sz w:val="28"/>
-          <w:szCs w:val="28"/>
-          <w:lang w:val="en-US"/>
-          <w14:ligatures w14:val="none"/>
-        </w:rPr>
-        <w:t xml:space="preserve">Please be informed that the meeting of the Board of Trustees of the </w:t>
-      </w:r>
-      <w:proofErr w:type="spellStart"/>
-      <w:r>
-        <w:rPr>
-          <w:rFonts w:ascii="Times New Roman" w:eastAsia="Times New Roman" w:hAnsi="Times New Roman" w:cs="Times New Roman"/>
-          <w:kern w:val="0"/>
-          <w:sz w:val="28"/>
-          <w:szCs w:val="28"/>
-          <w:lang w:val="en-US"/>
-          <w14:ligatures w14:val="none"/>
-        </w:rPr>
-        <w:t>Dalubhasaan</w:t>
-      </w:r>
-      <w:proofErr w:type="spellEnd"/>
-      <w:r>
-        <w:rPr>
-          <w:rFonts w:ascii="Times New Roman" w:eastAsia="Times New Roman" w:hAnsi="Times New Roman" w:cs="Times New Roman"/>
-          <w:kern w:val="0"/>
-          <w:sz w:val="28"/>
-          <w:szCs w:val="28"/>
-          <w:lang w:val="en-US"/>
-          <w14:ligatures w14:val="none"/>
-        </w:rPr>
-        <w:t xml:space="preserve"> ng </w:t>
-      </w:r>
-      <w:proofErr w:type="spellStart"/>
-      <w:r>
-        <w:rPr>
-          <w:rFonts w:ascii="Times New Roman" w:eastAsia="Times New Roman" w:hAnsi="Times New Roman" w:cs="Times New Roman"/>
-          <w:kern w:val="0"/>
-          <w:sz w:val="28"/>
-          <w:szCs w:val="28"/>
-          <w:lang w:val="en-US"/>
-          <w14:ligatures w14:val="none"/>
-        </w:rPr>
-        <w:t>Lungsod</w:t>
-      </w:r>
-      <w:proofErr w:type="spellEnd"/>
-      <w:r>
-        <w:rPr>
-          <w:rFonts w:ascii="Times New Roman" w:eastAsia="Times New Roman" w:hAnsi="Times New Roman" w:cs="Times New Roman"/>
-          <w:kern w:val="0"/>
-          <w:sz w:val="28"/>
-          <w:szCs w:val="28"/>
-          <w:lang w:val="en-US"/>
-          <w14:ligatures w14:val="none"/>
-        </w:rPr>
-        <w:t xml:space="preserve"> ng </w:t>
-      </w:r>
-      <w:proofErr w:type="spellStart"/>
-      <w:r>
-        <w:rPr>
-          <w:rFonts w:ascii="Times New Roman" w:eastAsia="Times New Roman" w:hAnsi="Times New Roman" w:cs="Times New Roman"/>
-          <w:kern w:val="0"/>
-          <w:sz w:val="28"/>
-          <w:szCs w:val="28"/>
-          <w:lang w:val="en-US"/>
-          <w14:ligatures w14:val="none"/>
-        </w:rPr>
-        <w:t>Lucena</w:t>
-      </w:r>
-      <w:proofErr w:type="spellEnd"/>
-      <w:r>
-        <w:rPr>
-          <w:rFonts w:ascii="Times New Roman" w:eastAsia="Times New Roman" w:hAnsi="Times New Roman" w:cs="Times New Roman"/>
-          <w:kern w:val="0"/>
-          <w:sz w:val="28"/>
-          <w:szCs w:val="28"/>
-          <w:lang w:val="en-US"/>
-          <w14:ligatures w14:val="none"/>
-        </w:rPr>
-        <w:t xml:space="preserve"> is set on </w:t>
-      </w:r>
-      <w:r>
-        <w:rPr>
-          <w:rFonts w:ascii="Times New Roman" w:eastAsia="Times New Roman" w:hAnsi="Times New Roman" w:cs="Times New Roman"/>
-          <w:b/>
-          <w:bCs/>
-          <w:kern w:val="0"/>
-          <w:sz w:val="28"/>
-          <w:szCs w:val="28"/>
-          <w:lang w:val="en-US"/>
-          <w14:ligatures w14:val="none"/>
-        </w:rPr>
-        <w:t>Tuesday</w:t>
-      </w:r>
-      <w:r>
-        <w:rPr>
-          <w:rFonts w:ascii="Times New Roman" w:eastAsia="Times New Roman" w:hAnsi="Times New Roman" w:cs="Times New Roman"/>
-          <w:b/>
-          <w:kern w:val="0"/>
-          <w:sz w:val="28"/>
-          <w:szCs w:val="28"/>
-          <w:lang w:val="en-US"/>
-          <w14:ligatures w14:val="none"/>
-        </w:rPr>
-        <w:t xml:space="preserve">, May 19, 2026, 10:30 in the morning at the President’s Office at the </w:t>
-      </w:r>
-      <w:proofErr w:type="spellStart"/>
-      <w:r>
-        <w:rPr>
-          <w:rFonts w:ascii="Times New Roman" w:eastAsia="Times New Roman" w:hAnsi="Times New Roman" w:cs="Times New Roman"/>
-          <w:b/>
-          <w:kern w:val="0"/>
-          <w:sz w:val="28"/>
-          <w:szCs w:val="28"/>
-          <w:lang w:val="en-US"/>
-          <w14:ligatures w14:val="none"/>
-        </w:rPr>
-        <w:t>Dalubhasaan</w:t>
-      </w:r>
-      <w:proofErr w:type="spellEnd"/>
-      <w:r>
-        <w:rPr>
-          <w:rFonts w:ascii="Times New Roman" w:eastAsia="Times New Roman" w:hAnsi="Times New Roman" w:cs="Times New Roman"/>
-          <w:b/>
-          <w:kern w:val="0"/>
-          <w:sz w:val="28"/>
-          <w:szCs w:val="28"/>
-          <w:lang w:val="en-US"/>
-          <w14:ligatures w14:val="none"/>
-        </w:rPr>
-        <w:t xml:space="preserve"> ng </w:t>
-      </w:r>
-      <w:proofErr w:type="spellStart"/>
-      <w:r>
-        <w:rPr>
-          <w:rFonts w:ascii="Times New Roman" w:eastAsia="Times New Roman" w:hAnsi="Times New Roman" w:cs="Times New Roman"/>
-          <w:b/>
-          <w:kern w:val="0"/>
-          <w:sz w:val="28"/>
-          <w:szCs w:val="28"/>
-          <w:lang w:val="en-US"/>
-          <w14:ligatures w14:val="none"/>
-        </w:rPr>
-        <w:t>Lungsod</w:t>
-      </w:r>
-      <w:proofErr w:type="spellEnd"/>
-      <w:r>
-        <w:rPr>
-          <w:rFonts w:ascii="Times New Roman" w:eastAsia="Times New Roman" w:hAnsi="Times New Roman" w:cs="Times New Roman"/>
-          <w:b/>
-          <w:kern w:val="0"/>
-          <w:sz w:val="28"/>
-          <w:szCs w:val="28"/>
-          <w:lang w:val="en-US"/>
-          <w14:ligatures w14:val="none"/>
-        </w:rPr>
-        <w:t xml:space="preserve"> ng </w:t>
-      </w:r>
-      <w:proofErr w:type="spellStart"/>
-      <w:r>
-        <w:rPr>
-          <w:rFonts w:ascii="Times New Roman" w:eastAsia="Times New Roman" w:hAnsi="Times New Roman" w:cs="Times New Roman"/>
-          <w:b/>
-          <w:kern w:val="0"/>
-          <w:sz w:val="28"/>
-          <w:szCs w:val="28"/>
-          <w:lang w:val="en-US"/>
-          <w14:ligatures w14:val="none"/>
-        </w:rPr>
-        <w:t>Lucena</w:t>
-      </w:r>
-      <w:proofErr w:type="spellEnd"/>
-      <w:r>
-        <w:rPr>
-          <w:rFonts w:ascii="Times New Roman" w:eastAsia="Times New Roman" w:hAnsi="Times New Roman" w:cs="Times New Roman"/>
-          <w:b/>
-          <w:kern w:val="0"/>
-          <w:sz w:val="28"/>
-          <w:szCs w:val="28"/>
-          <w:lang w:val="en-US"/>
-          <w14:ligatures w14:val="none"/>
-        </w:rPr>
-        <w:t xml:space="preserve"> Administration Office. </w:t>
-      </w:r>
-    </w:p>
-    <w:p>
-      <w:pPr>
-        <w:spacing w:after="0" w:line="240" w:lineRule="auto"/>
-        <w:rPr>
-          <w:rFonts w:ascii="Times New Roman" w:eastAsia="Times New Roman" w:hAnsi="Times New Roman" w:cs="Times New Roman"/>
-          <w:kern w:val="0"/>
-          <w:sz w:val="28"/>
-          <w:szCs w:val="28"/>
-          <w:lang w:val="en-US"/>
-          <w14:ligatures w14:val="none"/>
-        </w:rPr>
-      </w:pPr>
-    </w:p>
-    <w:p>
-      <w:pPr>
-        <w:spacing w:after="0" w:line="240" w:lineRule="auto"/>
-        <w:rPr>
-          <w:rFonts w:ascii="Times New Roman" w:eastAsia="Times New Roman" w:hAnsi="Times New Roman" w:cs="Times New Roman"/>
-          <w:kern w:val="0"/>
-          <w:sz w:val="28"/>
-          <w:szCs w:val="28"/>
-          <w:lang w:val="en-US"/>
-          <w14:ligatures w14:val="none"/>
-        </w:rPr>
-      </w:pPr>
-      <w:r>
-        <w:rPr>
-          <w:rFonts w:ascii="Times New Roman" w:eastAsia="Times New Roman" w:hAnsi="Times New Roman" w:cs="Times New Roman"/>
-          <w:kern w:val="0"/>
-          <w:sz w:val="28"/>
-          <w:szCs w:val="28"/>
-          <w:lang w:val="en-US"/>
-          <w14:ligatures w14:val="none"/>
-        </w:rPr>
-        <w:t>Important matters to be discussed on the said meeting are the following:</w:t>
-      </w:r>
-    </w:p>
-    <w:p>
-      <w:pPr>
-        <w:spacing w:after="0" w:line="240" w:lineRule="auto"/>
-        <w:rPr>
-          <w:rFonts w:ascii="Times New Roman" w:eastAsia="Times New Roman" w:hAnsi="Times New Roman" w:cs="Times New Roman"/>
-          <w:kern w:val="0"/>
-          <w:sz w:val="28"/>
-          <w:szCs w:val="28"/>
-          <w:lang w:val="en-US"/>
-          <w14:ligatures w14:val="none"/>
-        </w:rPr>
-      </w:pPr>
+        <w:t xml:space="preserve"> </w:t>
+      </w:r>
     </w:p>
     <w:p>
       <w:pPr>
@@ -1305,8 +694,639 @@
           <w:lang w:val="en-US"/>
           <w14:ligatures w14:val="none"/>
         </w:rPr>
-        <w:t>Deliberation and Conferment of Graduating Students</w:t>
-      </w:r>
+        <w:t>Board Chairman’s Time</w:t>
+      </w:r>
+    </w:p>
+    <w:p>
+      <w:pPr>
+        <w:spacing w:after="0" w:line="240" w:lineRule="auto"/>
+        <w:rPr>
+          <w:rFonts w:ascii="Times New Roman" w:eastAsia="Times New Roman" w:hAnsi="Times New Roman" w:cs="Times New Roman"/>
+          <w:kern w:val="0"/>
+          <w:sz w:val="28"/>
+          <w:szCs w:val="28"/>
+          <w:lang w:val="en-US"/>
+          <w14:ligatures w14:val="none"/>
+        </w:rPr>
+      </w:pPr>
+    </w:p>
+    <w:p>
+      <w:pPr>
+        <w:spacing w:after="0" w:line="240" w:lineRule="auto"/>
+        <w:rPr>
+          <w:rFonts w:ascii="Times New Roman" w:eastAsia="Times New Roman" w:hAnsi="Times New Roman" w:cs="Times New Roman"/>
+          <w:kern w:val="0"/>
+          <w:sz w:val="28"/>
+          <w:szCs w:val="28"/>
+          <w:lang w:val="en-US"/>
+          <w14:ligatures w14:val="none"/>
+        </w:rPr>
+      </w:pPr>
+      <w:r>
+        <w:rPr>
+          <w:rFonts w:ascii="Times New Roman" w:eastAsia="Times New Roman" w:hAnsi="Times New Roman" w:cs="Times New Roman"/>
+          <w:kern w:val="0"/>
+          <w:sz w:val="28"/>
+          <w:szCs w:val="28"/>
+          <w:lang w:val="en-US"/>
+          <w14:ligatures w14:val="none"/>
+        </w:rPr>
+        <w:t>We highly appreciate your personal presence in the said meeting. Thank you very much.</w:t>
+      </w:r>
+    </w:p>
+    <w:p>
+      <w:pPr>
+        <w:spacing w:after="0" w:line="240" w:lineRule="auto"/>
+        <w:rPr>
+          <w:rFonts w:ascii="Times New Roman" w:eastAsia="Times New Roman" w:hAnsi="Times New Roman" w:cs="Times New Roman"/>
+          <w:kern w:val="0"/>
+          <w:sz w:val="28"/>
+          <w:szCs w:val="28"/>
+          <w:lang w:val="en-US"/>
+          <w14:ligatures w14:val="none"/>
+        </w:rPr>
+      </w:pPr>
+    </w:p>
+    <w:p>
+      <w:pPr>
+        <w:spacing w:after="0" w:line="240" w:lineRule="auto"/>
+        <w:rPr>
+          <w:rFonts w:ascii="Times New Roman" w:eastAsia="Times New Roman" w:hAnsi="Times New Roman" w:cs="Times New Roman"/>
+          <w:kern w:val="0"/>
+          <w:sz w:val="28"/>
+          <w:szCs w:val="28"/>
+          <w:lang w:val="en-US"/>
+          <w14:ligatures w14:val="none"/>
+        </w:rPr>
+      </w:pPr>
+      <w:r>
+        <w:rPr>
+          <w:rFonts w:ascii="Times New Roman" w:eastAsia="Times New Roman" w:hAnsi="Times New Roman" w:cs="Times New Roman"/>
+          <w:kern w:val="0"/>
+          <w:sz w:val="28"/>
+          <w:szCs w:val="28"/>
+          <w:lang w:val="en-US"/>
+          <w14:ligatures w14:val="none"/>
+        </w:rPr>
+        <w:t>Very truly yours,</w:t>
+      </w:r>
+    </w:p>
+    <w:p>
+      <w:pPr>
+        <w:spacing w:after="0" w:line="240" w:lineRule="auto"/>
+        <w:rPr>
+          <w:rFonts w:ascii="Times New Roman" w:eastAsia="Times New Roman" w:hAnsi="Times New Roman" w:cs="Times New Roman"/>
+          <w:kern w:val="0"/>
+          <w:sz w:val="28"/>
+          <w:szCs w:val="28"/>
+          <w:lang w:val="en-US"/>
+          <w14:ligatures w14:val="none"/>
+        </w:rPr>
+      </w:pPr>
+    </w:p>
+    <w:p>
+      <w:pPr>
+        <w:spacing w:after="0" w:line="240" w:lineRule="auto"/>
+        <w:rPr>
+          <w:rFonts w:ascii="Times New Roman" w:eastAsia="Times New Roman" w:hAnsi="Times New Roman" w:cs="Times New Roman"/>
+          <w:kern w:val="0"/>
+          <w:sz w:val="28"/>
+          <w:szCs w:val="28"/>
+          <w:lang w:val="en-US"/>
+          <w14:ligatures w14:val="none"/>
+        </w:rPr>
+      </w:pPr>
+    </w:p>
+    <w:p>
+      <w:pPr>
+        <w:spacing w:after="0" w:line="240" w:lineRule="auto"/>
+        <w:rPr>
+          <w:rFonts w:ascii="Times New Roman" w:eastAsia="Times New Roman" w:hAnsi="Times New Roman" w:cs="Times New Roman"/>
+          <w:kern w:val="0"/>
+          <w:sz w:val="28"/>
+          <w:szCs w:val="28"/>
+          <w:lang w:val="en-US"/>
+          <w14:ligatures w14:val="none"/>
+        </w:rPr>
+      </w:pPr>
+    </w:p>
+    <w:p>
+      <w:pPr>
+        <w:spacing w:after="0" w:line="240" w:lineRule="auto"/>
+        <w:rPr>
+          <w:rFonts w:ascii="Times New Roman" w:eastAsia="Times New Roman" w:hAnsi="Times New Roman" w:cs="Times New Roman"/>
+          <w:b/>
+          <w:kern w:val="0"/>
+          <w:sz w:val="28"/>
+          <w:szCs w:val="28"/>
+          <w:lang w:val="en-US"/>
+          <w14:ligatures w14:val="none"/>
+        </w:rPr>
+      </w:pPr>
+      <w:r>
+        <w:rPr>
+          <w:rFonts w:ascii="Times New Roman" w:eastAsia="Times New Roman" w:hAnsi="Times New Roman" w:cs="Times New Roman"/>
+          <w:b/>
+          <w:kern w:val="0"/>
+          <w:sz w:val="28"/>
+          <w:szCs w:val="28"/>
+          <w:lang w:val="en-US"/>
+          <w14:ligatures w14:val="none"/>
+        </w:rPr>
+        <w:t xml:space="preserve">Hon. MARK DON VICTOR B. ALCALA </w:t>
+      </w:r>
+    </w:p>
+    <w:p>
+      <w:pPr>
+        <w:spacing w:after="0" w:line="240" w:lineRule="auto"/>
+        <w:rPr>
+          <w:rFonts w:ascii="Times New Roman" w:eastAsia="Times New Roman" w:hAnsi="Times New Roman" w:cs="Times New Roman"/>
+          <w:kern w:val="0"/>
+          <w:sz w:val="28"/>
+          <w:szCs w:val="28"/>
+          <w:lang w:val="en-US"/>
+          <w14:ligatures w14:val="none"/>
+        </w:rPr>
+      </w:pPr>
+      <w:r>
+        <w:rPr>
+          <w:rFonts w:ascii="Times New Roman" w:eastAsia="Times New Roman" w:hAnsi="Times New Roman" w:cs="Times New Roman"/>
+          <w:kern w:val="0"/>
+          <w:sz w:val="28"/>
+          <w:szCs w:val="28"/>
+          <w:lang w:val="en-US"/>
+          <w14:ligatures w14:val="none"/>
+        </w:rPr>
+        <w:t>Chairman, Board of Trustees</w:t>
+      </w:r>
+    </w:p>
+    <w:p>
+      <w:pPr>
+        <w:spacing w:after="0" w:line="240" w:lineRule="auto"/>
+        <w:rPr>
+          <w:rFonts w:ascii="Times New Roman" w:eastAsia="Times New Roman" w:hAnsi="Times New Roman" w:cs="Times New Roman"/>
+          <w:kern w:val="0"/>
+          <w:sz w:val="28"/>
+          <w:szCs w:val="28"/>
+          <w:lang w:val="en-US"/>
+          <w14:ligatures w14:val="none"/>
+        </w:rPr>
+      </w:pPr>
+    </w:p>
+    <w:p>
+      <w:pPr>
+        <w:spacing w:after="0" w:line="240" w:lineRule="auto"/>
+        <w:rPr>
+          <w:rFonts w:ascii="Times New Roman" w:eastAsia="Times New Roman" w:hAnsi="Times New Roman" w:cs="Times New Roman"/>
+          <w:kern w:val="0"/>
+          <w:sz w:val="28"/>
+          <w:szCs w:val="28"/>
+          <w:lang w:val="en-US"/>
+          <w14:ligatures w14:val="none"/>
+        </w:rPr>
+      </w:pPr>
+    </w:p>
+    <w:p>
+      <w:pPr>
+        <w:spacing w:after="0" w:line="240" w:lineRule="auto"/>
+        <w:rPr>
+          <w:rFonts w:ascii="Times New Roman" w:eastAsia="Times New Roman" w:hAnsi="Times New Roman" w:cs="Times New Roman"/>
+          <w:kern w:val="0"/>
+          <w:sz w:val="28"/>
+          <w:szCs w:val="28"/>
+          <w:lang w:val="en-US"/>
+          <w14:ligatures w14:val="none"/>
+        </w:rPr>
+      </w:pPr>
+    </w:p>
+    <w:p>
+      <w:pPr>
+        <w:rPr>
+          <w:rFonts w:ascii="Times New Roman" w:hAnsi="Times New Roman" w:cs="Times New Roman"/>
+        </w:rPr>
+      </w:pPr>
+    </w:p>
+    <w:p>
+      <w:pPr>
+        <w:rPr>
+          <w:rFonts w:ascii="Times New Roman" w:hAnsi="Times New Roman" w:cs="Times New Roman"/>
+        </w:rPr>
+      </w:pPr>
+    </w:p>
+    <w:p>
+      <w:pPr>
+        <w:rPr>
+          <w:rFonts w:ascii="Times New Roman" w:hAnsi="Times New Roman" w:cs="Times New Roman"/>
+        </w:rPr>
+      </w:pPr>
+    </w:p>
+    <w:p>
+      <w:pPr>
+        <w:rPr>
+          <w:rFonts w:ascii="Times New Roman" w:hAnsi="Times New Roman" w:cs="Times New Roman"/>
+        </w:rPr>
+      </w:pPr>
+      <w:r>
+        <w:rPr>
+          <w:rFonts w:ascii="Times New Roman" w:hAnsi="Times New Roman" w:cs="Times New Roman"/>
+        </w:rPr>
+        <w:br w:type="page"/>
+      </w:r>
+    </w:p>
+    <w:p>
+      <w:pPr>
+        <w:spacing w:after="0" w:line="240" w:lineRule="auto"/>
+        <w:rPr>
+          <w:rFonts w:ascii="Times New Roman" w:eastAsia="Times New Roman" w:hAnsi="Times New Roman" w:cs="Times New Roman"/>
+          <w:kern w:val="0"/>
+          <w:sz w:val="28"/>
+          <w:szCs w:val="28"/>
+          <w:lang w:val="en-US"/>
+          <w14:ligatures w14:val="none"/>
+        </w:rPr>
+      </w:pPr>
+    </w:p>
+    <w:p>
+      <w:pPr>
+        <w:spacing w:after="0" w:line="240" w:lineRule="auto"/>
+        <w:rPr>
+          <w:rFonts w:ascii="Times New Roman" w:eastAsia="Times New Roman" w:hAnsi="Times New Roman" w:cs="Times New Roman"/>
+          <w:kern w:val="0"/>
+          <w:sz w:val="28"/>
+          <w:szCs w:val="28"/>
+          <w:lang w:val="en-US"/>
+          <w14:ligatures w14:val="none"/>
+        </w:rPr>
+      </w:pPr>
+      <w:r>
+        <w:rPr>
+          <w:rFonts w:ascii="Times New Roman" w:eastAsia="Times New Roman" w:hAnsi="Times New Roman" w:cs="Times New Roman"/>
+          <w:kern w:val="0"/>
+          <w:sz w:val="28"/>
+          <w:szCs w:val="28"/>
+          <w:lang w:val="en-US"/>
+          <w14:ligatures w14:val="none"/>
+        </w:rPr>
+        <w:t>May 14, 2026</w:t>
+      </w:r>
+    </w:p>
+    <w:p>
+      <w:pPr>
+        <w:tabs>
+          <w:tab w:val="left" w:pos="1440"/>
+        </w:tabs>
+        <w:spacing w:after="0" w:line="240" w:lineRule="auto"/>
+        <w:rPr>
+          <w:rFonts w:ascii="Times New Roman" w:eastAsia="Times New Roman" w:hAnsi="Times New Roman" w:cs="Times New Roman"/>
+          <w:kern w:val="0"/>
+          <w:sz w:val="28"/>
+          <w:szCs w:val="28"/>
+          <w:lang w:val="en-US"/>
+          <w14:ligatures w14:val="none"/>
+        </w:rPr>
+      </w:pPr>
+      <w:r>
+        <w:rPr>
+          <w:rFonts w:ascii="Times New Roman" w:eastAsia="Times New Roman" w:hAnsi="Times New Roman" w:cs="Times New Roman"/>
+          <w:kern w:val="0"/>
+          <w:sz w:val="28"/>
+          <w:szCs w:val="28"/>
+          <w:lang w:val="en-US"/>
+          <w14:ligatures w14:val="none"/>
+        </w:rPr>
+        <w:tab/>
+      </w:r>
+    </w:p>
+    <w:p>
+      <w:pPr>
+        <w:spacing w:after="0"/>
+        <w:rPr>
+          <w:rFonts w:ascii="Times New Roman" w:hAnsi="Times New Roman" w:cs="Times New Roman"/>
+          <w:b/>
+          <w:sz w:val="28"/>
+          <w:szCs w:val="28"/>
+        </w:rPr>
+      </w:pPr>
+      <w:r>
+        <w:rPr>
+          <w:rFonts w:ascii="Times New Roman" w:hAnsi="Times New Roman" w:cs="Times New Roman"/>
+          <w:b/>
+          <w:sz w:val="28"/>
+          <w:szCs w:val="28"/>
+        </w:rPr>
+        <w:t>Mr. Gaspar K. Ong</w:t>
+      </w:r>
+    </w:p>
+    <w:p>
+      <w:pPr>
+        <w:spacing w:after="0"/>
+        <w:rPr>
+          <w:rFonts w:ascii="Times New Roman" w:hAnsi="Times New Roman" w:cs="Times New Roman"/>
+          <w:sz w:val="28"/>
+          <w:szCs w:val="28"/>
+        </w:rPr>
+      </w:pPr>
+      <w:r>
+        <w:rPr>
+          <w:rFonts w:ascii="Times New Roman" w:hAnsi="Times New Roman" w:cs="Times New Roman"/>
+          <w:sz w:val="28"/>
+          <w:szCs w:val="28"/>
+        </w:rPr>
+        <w:t>Member</w:t>
+      </w:r>
+    </w:p>
+    <w:p>
+      <w:pPr>
+        <w:rPr>
+          <w:rFonts w:ascii="Times New Roman" w:hAnsi="Times New Roman" w:cs="Times New Roman"/>
+          <w:b/>
+          <w:sz w:val="28"/>
+          <w:szCs w:val="28"/>
+        </w:rPr>
+      </w:pPr>
+    </w:p>
+    <w:p>
+      <w:pPr>
+        <w:rPr>
+          <w:rFonts w:ascii="Times New Roman" w:hAnsi="Times New Roman" w:cs="Times New Roman"/>
+          <w:b/>
+          <w:sz w:val="28"/>
+          <w:szCs w:val="28"/>
+        </w:rPr>
+      </w:pPr>
+      <w:r>
+        <w:rPr>
+          <w:rFonts w:ascii="Times New Roman" w:hAnsi="Times New Roman" w:cs="Times New Roman"/>
+          <w:b/>
+          <w:sz w:val="28"/>
+          <w:szCs w:val="28"/>
+        </w:rPr>
+        <w:t>Dear Mr. Ong:</w:t>
+      </w:r>
+    </w:p>
+    <w:p>
+      <w:pPr>
+        <w:spacing w:after="0" w:line="240" w:lineRule="auto"/>
+        <w:rPr>
+          <w:rFonts w:ascii="Times New Roman" w:eastAsia="Times New Roman" w:hAnsi="Times New Roman" w:cs="Times New Roman"/>
+          <w:kern w:val="0"/>
+          <w:sz w:val="28"/>
+          <w:szCs w:val="28"/>
+          <w:lang w:val="en-US"/>
+          <w14:ligatures w14:val="none"/>
+        </w:rPr>
+      </w:pPr>
+    </w:p>
+    <w:p>
+      <w:pPr>
+        <w:spacing w:after="0" w:line="240" w:lineRule="auto"/>
+        <w:jc w:val="both"/>
+        <w:rPr>
+          <w:rFonts w:ascii="Times New Roman" w:eastAsia="Times New Roman" w:hAnsi="Times New Roman" w:cs="Times New Roman"/>
+          <w:b/>
+          <w:kern w:val="0"/>
+          <w:sz w:val="28"/>
+          <w:szCs w:val="28"/>
+          <w:lang w:val="en-US"/>
+          <w14:ligatures w14:val="none"/>
+        </w:rPr>
+      </w:pPr>
+      <w:r>
+        <w:rPr>
+          <w:rFonts w:ascii="Times New Roman" w:eastAsia="Times New Roman" w:hAnsi="Times New Roman" w:cs="Times New Roman"/>
+          <w:kern w:val="0"/>
+          <w:sz w:val="28"/>
+          <w:szCs w:val="28"/>
+          <w:lang w:val="en-US"/>
+          <w14:ligatures w14:val="none"/>
+        </w:rPr>
+        <w:t xml:space="preserve">Please be informed that the meeting of the Board of Trustees of the </w:t>
+      </w:r>
+      <w:proofErr w:type="spellStart"/>
+      <w:r>
+        <w:rPr>
+          <w:rFonts w:ascii="Times New Roman" w:eastAsia="Times New Roman" w:hAnsi="Times New Roman" w:cs="Times New Roman"/>
+          <w:kern w:val="0"/>
+          <w:sz w:val="28"/>
+          <w:szCs w:val="28"/>
+          <w:lang w:val="en-US"/>
+          <w14:ligatures w14:val="none"/>
+        </w:rPr>
+        <w:t>Dalubhasaan</w:t>
+      </w:r>
+      <w:proofErr w:type="spellEnd"/>
+      <w:r>
+        <w:rPr>
+          <w:rFonts w:ascii="Times New Roman" w:eastAsia="Times New Roman" w:hAnsi="Times New Roman" w:cs="Times New Roman"/>
+          <w:kern w:val="0"/>
+          <w:sz w:val="28"/>
+          <w:szCs w:val="28"/>
+          <w:lang w:val="en-US"/>
+          <w14:ligatures w14:val="none"/>
+        </w:rPr>
+        <w:t xml:space="preserve"> ng </w:t>
+      </w:r>
+      <w:proofErr w:type="spellStart"/>
+      <w:r>
+        <w:rPr>
+          <w:rFonts w:ascii="Times New Roman" w:eastAsia="Times New Roman" w:hAnsi="Times New Roman" w:cs="Times New Roman"/>
+          <w:kern w:val="0"/>
+          <w:sz w:val="28"/>
+          <w:szCs w:val="28"/>
+          <w:lang w:val="en-US"/>
+          <w14:ligatures w14:val="none"/>
+        </w:rPr>
+        <w:t>Lungsod</w:t>
+      </w:r>
+      <w:proofErr w:type="spellEnd"/>
+      <w:r>
+        <w:rPr>
+          <w:rFonts w:ascii="Times New Roman" w:eastAsia="Times New Roman" w:hAnsi="Times New Roman" w:cs="Times New Roman"/>
+          <w:kern w:val="0"/>
+          <w:sz w:val="28"/>
+          <w:szCs w:val="28"/>
+          <w:lang w:val="en-US"/>
+          <w14:ligatures w14:val="none"/>
+        </w:rPr>
+        <w:t xml:space="preserve"> ng </w:t>
+      </w:r>
+      <w:proofErr w:type="spellStart"/>
+      <w:r>
+        <w:rPr>
+          <w:rFonts w:ascii="Times New Roman" w:eastAsia="Times New Roman" w:hAnsi="Times New Roman" w:cs="Times New Roman"/>
+          <w:kern w:val="0"/>
+          <w:sz w:val="28"/>
+          <w:szCs w:val="28"/>
+          <w:lang w:val="en-US"/>
+          <w14:ligatures w14:val="none"/>
+        </w:rPr>
+        <w:t>Lucena</w:t>
+      </w:r>
+      <w:proofErr w:type="spellEnd"/>
+      <w:r>
+        <w:rPr>
+          <w:rFonts w:ascii="Times New Roman" w:eastAsia="Times New Roman" w:hAnsi="Times New Roman" w:cs="Times New Roman"/>
+          <w:kern w:val="0"/>
+          <w:sz w:val="28"/>
+          <w:szCs w:val="28"/>
+          <w:lang w:val="en-US"/>
+          <w14:ligatures w14:val="none"/>
+        </w:rPr>
+        <w:t xml:space="preserve"> is set on </w:t>
+      </w:r>
+      <w:r>
+        <w:rPr>
+          <w:rFonts w:ascii="Times New Roman" w:eastAsia="Times New Roman" w:hAnsi="Times New Roman" w:cs="Times New Roman"/>
+          <w:b/>
+          <w:bCs/>
+          <w:kern w:val="0"/>
+          <w:sz w:val="28"/>
+          <w:szCs w:val="28"/>
+          <w:lang w:val="en-US"/>
+          <w14:ligatures w14:val="none"/>
+        </w:rPr>
+        <w:t>Tuesday</w:t>
+      </w:r>
+      <w:r>
+        <w:rPr>
+          <w:rFonts w:ascii="Times New Roman" w:eastAsia="Times New Roman" w:hAnsi="Times New Roman" w:cs="Times New Roman"/>
+          <w:b/>
+          <w:kern w:val="0"/>
+          <w:sz w:val="28"/>
+          <w:szCs w:val="28"/>
+          <w:lang w:val="en-US"/>
+          <w14:ligatures w14:val="none"/>
+        </w:rPr>
+        <w:t xml:space="preserve">, May 19, 2026, 10:30 in the morning at the President’s Office at the </w:t>
+      </w:r>
+      <w:proofErr w:type="spellStart"/>
+      <w:r>
+        <w:rPr>
+          <w:rFonts w:ascii="Times New Roman" w:eastAsia="Times New Roman" w:hAnsi="Times New Roman" w:cs="Times New Roman"/>
+          <w:b/>
+          <w:kern w:val="0"/>
+          <w:sz w:val="28"/>
+          <w:szCs w:val="28"/>
+          <w:lang w:val="en-US"/>
+          <w14:ligatures w14:val="none"/>
+        </w:rPr>
+        <w:t>Dalubhasaan</w:t>
+      </w:r>
+      <w:proofErr w:type="spellEnd"/>
+      <w:r>
+        <w:rPr>
+          <w:rFonts w:ascii="Times New Roman" w:eastAsia="Times New Roman" w:hAnsi="Times New Roman" w:cs="Times New Roman"/>
+          <w:b/>
+          <w:kern w:val="0"/>
+          <w:sz w:val="28"/>
+          <w:szCs w:val="28"/>
+          <w:lang w:val="en-US"/>
+          <w14:ligatures w14:val="none"/>
+        </w:rPr>
+        <w:t xml:space="preserve"> ng </w:t>
+      </w:r>
+      <w:proofErr w:type="spellStart"/>
+      <w:r>
+        <w:rPr>
+          <w:rFonts w:ascii="Times New Roman" w:eastAsia="Times New Roman" w:hAnsi="Times New Roman" w:cs="Times New Roman"/>
+          <w:b/>
+          <w:kern w:val="0"/>
+          <w:sz w:val="28"/>
+          <w:szCs w:val="28"/>
+          <w:lang w:val="en-US"/>
+          <w14:ligatures w14:val="none"/>
+        </w:rPr>
+        <w:t>Lungsod</w:t>
+      </w:r>
+      <w:proofErr w:type="spellEnd"/>
+      <w:r>
+        <w:rPr>
+          <w:rFonts w:ascii="Times New Roman" w:eastAsia="Times New Roman" w:hAnsi="Times New Roman" w:cs="Times New Roman"/>
+          <w:b/>
+          <w:kern w:val="0"/>
+          <w:sz w:val="28"/>
+          <w:szCs w:val="28"/>
+          <w:lang w:val="en-US"/>
+          <w14:ligatures w14:val="none"/>
+        </w:rPr>
+        <w:t xml:space="preserve"> ng </w:t>
+      </w:r>
+      <w:proofErr w:type="spellStart"/>
+      <w:r>
+        <w:rPr>
+          <w:rFonts w:ascii="Times New Roman" w:eastAsia="Times New Roman" w:hAnsi="Times New Roman" w:cs="Times New Roman"/>
+          <w:b/>
+          <w:kern w:val="0"/>
+          <w:sz w:val="28"/>
+          <w:szCs w:val="28"/>
+          <w:lang w:val="en-US"/>
+          <w14:ligatures w14:val="none"/>
+        </w:rPr>
+        <w:t>Lucena</w:t>
+      </w:r>
+      <w:proofErr w:type="spellEnd"/>
+      <w:r>
+        <w:rPr>
+          <w:rFonts w:ascii="Times New Roman" w:eastAsia="Times New Roman" w:hAnsi="Times New Roman" w:cs="Times New Roman"/>
+          <w:b/>
+          <w:kern w:val="0"/>
+          <w:sz w:val="28"/>
+          <w:szCs w:val="28"/>
+          <w:lang w:val="en-US"/>
+          <w14:ligatures w14:val="none"/>
+        </w:rPr>
+        <w:t xml:space="preserve"> Administration Office. </w:t>
+      </w:r>
+    </w:p>
+    <w:p>
+      <w:pPr>
+        <w:spacing w:after="0" w:line="240" w:lineRule="auto"/>
+        <w:rPr>
+          <w:rFonts w:ascii="Times New Roman" w:eastAsia="Times New Roman" w:hAnsi="Times New Roman" w:cs="Times New Roman"/>
+          <w:kern w:val="0"/>
+          <w:sz w:val="28"/>
+          <w:szCs w:val="28"/>
+          <w:lang w:val="en-US"/>
+          <w14:ligatures w14:val="none"/>
+        </w:rPr>
+      </w:pPr>
+    </w:p>
+    <w:p>
+      <w:pPr>
+        <w:spacing w:after="0" w:line="240" w:lineRule="auto"/>
+        <w:rPr>
+          <w:rFonts w:ascii="Times New Roman" w:eastAsia="Times New Roman" w:hAnsi="Times New Roman" w:cs="Times New Roman"/>
+          <w:kern w:val="0"/>
+          <w:sz w:val="28"/>
+          <w:szCs w:val="28"/>
+          <w:lang w:val="en-US"/>
+          <w14:ligatures w14:val="none"/>
+        </w:rPr>
+      </w:pPr>
+      <w:r>
+        <w:rPr>
+          <w:rFonts w:ascii="Times New Roman" w:eastAsia="Times New Roman" w:hAnsi="Times New Roman" w:cs="Times New Roman"/>
+          <w:kern w:val="0"/>
+          <w:sz w:val="28"/>
+          <w:szCs w:val="28"/>
+          <w:lang w:val="en-US"/>
+          <w14:ligatures w14:val="none"/>
+        </w:rPr>
+        <w:t>Important matters to be discussed on the said meeting are the following:</w:t>
+      </w:r>
+    </w:p>
+    <w:p>
+      <w:pPr>
+        <w:spacing w:after="0" w:line="240" w:lineRule="auto"/>
+        <w:rPr>
+          <w:rFonts w:ascii="Times New Roman" w:eastAsia="Times New Roman" w:hAnsi="Times New Roman" w:cs="Times New Roman"/>
+          <w:kern w:val="0"/>
+          <w:sz w:val="28"/>
+          <w:szCs w:val="28"/>
+          <w:lang w:val="en-US"/>
+          <w14:ligatures w14:val="none"/>
+        </w:rPr>
+      </w:pPr>
     </w:p>
     <w:p>
       <w:pPr>
@@ -1333,7 +1353,7 @@
           <w:lang w:val="en-US"/>
           <w14:ligatures w14:val="none"/>
         </w:rPr>
-        <w:t>Budget for Commencement Rights 2026</w:t>
+        <w:t>Deliberation and Conferment of Graduating Students</w:t>
       </w:r>
     </w:p>
     <w:p>
@@ -1361,736 +1381,30 @@
           <w:lang w:val="en-US"/>
           <w14:ligatures w14:val="none"/>
         </w:rPr>
-        <w:t>Other Matters</w:t>
-      </w:r>
-      <w:r>
-        <w:rPr>
-          <w:rFonts w:ascii="Times New Roman" w:eastAsia="Times New Roman" w:hAnsi="Times New Roman" w:cs="Times New Roman"/>
-          <w:kern w:val="0"/>
-          <w:sz w:val="28"/>
-          <w:szCs w:val="28"/>
-          <w:lang w:val="en-US"/>
-          <w14:ligatures w14:val="none"/>
-        </w:rPr>
-        <w:t xml:space="preserve"> (Board Chairman’s Time)</w:t>
-      </w:r>
-    </w:p>
-    <w:p>
-      <w:pPr>
-        <w:spacing w:after="0" w:line="240" w:lineRule="auto"/>
-        <w:rPr>
-          <w:rFonts w:ascii="Times New Roman" w:eastAsia="Times New Roman" w:hAnsi="Times New Roman" w:cs="Times New Roman"/>
-          <w:kern w:val="0"/>
-          <w:sz w:val="28"/>
-          <w:szCs w:val="28"/>
-          <w:lang w:val="en-US"/>
-          <w14:ligatures w14:val="none"/>
-        </w:rPr>
-      </w:pPr>
-    </w:p>
-    <w:p>
-      <w:pPr>
-        <w:spacing w:after="0" w:line="240" w:lineRule="auto"/>
-        <w:rPr>
-          <w:rFonts w:ascii="Times New Roman" w:eastAsia="Times New Roman" w:hAnsi="Times New Roman" w:cs="Times New Roman"/>
-          <w:kern w:val="0"/>
-          <w:sz w:val="28"/>
-          <w:szCs w:val="28"/>
-          <w:lang w:val="en-US"/>
-          <w14:ligatures w14:val="none"/>
-        </w:rPr>
-      </w:pPr>
-      <w:r>
-        <w:rPr>
-          <w:rFonts w:ascii="Times New Roman" w:eastAsia="Times New Roman" w:hAnsi="Times New Roman" w:cs="Times New Roman"/>
-          <w:kern w:val="0"/>
-          <w:sz w:val="28"/>
-          <w:szCs w:val="28"/>
-          <w:lang w:val="en-US"/>
-          <w14:ligatures w14:val="none"/>
-        </w:rPr>
-        <w:t>We highly appreciate your personal presence in the said meeting. Thank you very much.</w:t>
-      </w:r>
-    </w:p>
-    <w:p>
-      <w:pPr>
-        <w:spacing w:after="0" w:line="240" w:lineRule="auto"/>
-        <w:rPr>
-          <w:rFonts w:ascii="Times New Roman" w:eastAsia="Times New Roman" w:hAnsi="Times New Roman" w:cs="Times New Roman"/>
-          <w:kern w:val="0"/>
-          <w:sz w:val="28"/>
-          <w:szCs w:val="28"/>
-          <w:lang w:val="en-US"/>
-          <w14:ligatures w14:val="none"/>
-        </w:rPr>
-      </w:pPr>
-    </w:p>
-    <w:p>
-      <w:pPr>
-        <w:spacing w:after="0" w:line="240" w:lineRule="auto"/>
-        <w:rPr>
-          <w:rFonts w:ascii="Times New Roman" w:eastAsia="Times New Roman" w:hAnsi="Times New Roman" w:cs="Times New Roman"/>
-          <w:kern w:val="0"/>
-          <w:sz w:val="28"/>
-          <w:szCs w:val="28"/>
-          <w:lang w:val="en-US"/>
-          <w14:ligatures w14:val="none"/>
-        </w:rPr>
-      </w:pPr>
-      <w:r>
-        <w:rPr>
-          <w:rFonts w:ascii="Times New Roman" w:eastAsia="Times New Roman" w:hAnsi="Times New Roman" w:cs="Times New Roman"/>
-          <w:kern w:val="0"/>
-          <w:sz w:val="28"/>
-          <w:szCs w:val="28"/>
-          <w:lang w:val="en-US"/>
-          <w14:ligatures w14:val="none"/>
-        </w:rPr>
-        <w:t>Very truly yours,</w:t>
-      </w:r>
-    </w:p>
-    <w:p>
-      <w:pPr>
-        <w:spacing w:after="0" w:line="240" w:lineRule="auto"/>
-        <w:rPr>
-          <w:rFonts w:ascii="Times New Roman" w:eastAsia="Times New Roman" w:hAnsi="Times New Roman" w:cs="Times New Roman"/>
-          <w:kern w:val="0"/>
-          <w:sz w:val="28"/>
-          <w:szCs w:val="28"/>
-          <w:lang w:val="en-US"/>
-          <w14:ligatures w14:val="none"/>
-        </w:rPr>
-      </w:pPr>
-    </w:p>
-    <w:p>
-      <w:pPr>
-        <w:spacing w:after="0" w:line="240" w:lineRule="auto"/>
-        <w:rPr>
-          <w:rFonts w:ascii="Times New Roman" w:eastAsia="Times New Roman" w:hAnsi="Times New Roman" w:cs="Times New Roman"/>
-          <w:kern w:val="0"/>
-          <w:sz w:val="28"/>
-          <w:szCs w:val="28"/>
-          <w:lang w:val="en-US"/>
-          <w14:ligatures w14:val="none"/>
-        </w:rPr>
-      </w:pPr>
-    </w:p>
-    <w:p>
-      <w:pPr>
-        <w:spacing w:after="0" w:line="240" w:lineRule="auto"/>
-        <w:rPr>
-          <w:rFonts w:ascii="Times New Roman" w:eastAsia="Times New Roman" w:hAnsi="Times New Roman" w:cs="Times New Roman"/>
-          <w:kern w:val="0"/>
-          <w:sz w:val="28"/>
-          <w:szCs w:val="28"/>
-          <w:lang w:val="en-US"/>
-          <w14:ligatures w14:val="none"/>
-        </w:rPr>
-      </w:pPr>
-    </w:p>
-    <w:p>
-      <w:pPr>
-        <w:spacing w:after="0" w:line="240" w:lineRule="auto"/>
-        <w:rPr>
-          <w:rFonts w:ascii="Times New Roman" w:eastAsia="Times New Roman" w:hAnsi="Times New Roman" w:cs="Times New Roman"/>
-          <w:b/>
-          <w:kern w:val="0"/>
-          <w:sz w:val="28"/>
-          <w:szCs w:val="28"/>
-          <w:lang w:val="en-US"/>
-          <w14:ligatures w14:val="none"/>
-        </w:rPr>
-      </w:pPr>
-      <w:r>
-        <w:rPr>
-          <w:rFonts w:ascii="Times New Roman" w:eastAsia="Times New Roman" w:hAnsi="Times New Roman" w:cs="Times New Roman"/>
-          <w:b/>
-          <w:kern w:val="0"/>
-          <w:sz w:val="28"/>
-          <w:szCs w:val="28"/>
-          <w:lang w:val="en-US"/>
-          <w14:ligatures w14:val="none"/>
-        </w:rPr>
-        <w:t xml:space="preserve">Hon. MARK DON VICTOR B. ALCALA </w:t>
-      </w:r>
-    </w:p>
-    <w:p>
-      <w:pPr>
-        <w:spacing w:after="0" w:line="240" w:lineRule="auto"/>
-        <w:rPr>
-          <w:rFonts w:ascii="Times New Roman" w:eastAsia="Times New Roman" w:hAnsi="Times New Roman" w:cs="Times New Roman"/>
-          <w:kern w:val="0"/>
-          <w:sz w:val="28"/>
-          <w:szCs w:val="28"/>
-          <w:lang w:val="en-US"/>
-          <w14:ligatures w14:val="none"/>
-        </w:rPr>
-      </w:pPr>
-      <w:r>
-        <w:rPr>
-          <w:rFonts w:ascii="Times New Roman" w:eastAsia="Times New Roman" w:hAnsi="Times New Roman" w:cs="Times New Roman"/>
-          <w:kern w:val="0"/>
-          <w:sz w:val="28"/>
-          <w:szCs w:val="28"/>
-          <w:lang w:val="en-US"/>
-          <w14:ligatures w14:val="none"/>
-        </w:rPr>
-        <w:t>Chairman, Board of Trustees</w:t>
-      </w:r>
-    </w:p>
-    <w:p>
-      <w:pPr>
-        <w:spacing w:after="0" w:line="240" w:lineRule="auto"/>
-        <w:rPr>
-          <w:rFonts w:ascii="Times New Roman" w:eastAsia="Times New Roman" w:hAnsi="Times New Roman" w:cs="Times New Roman"/>
-          <w:kern w:val="0"/>
-          <w:sz w:val="28"/>
-          <w:szCs w:val="28"/>
-          <w:lang w:val="en-US"/>
-          <w14:ligatures w14:val="none"/>
-        </w:rPr>
-      </w:pPr>
-    </w:p>
-    <w:p>
-      <w:pPr>
-        <w:spacing w:after="0" w:line="240" w:lineRule="auto"/>
-        <w:rPr>
-          <w:rFonts w:ascii="Times New Roman" w:eastAsia="Times New Roman" w:hAnsi="Times New Roman" w:cs="Times New Roman"/>
-          <w:kern w:val="0"/>
-          <w:sz w:val="28"/>
-          <w:szCs w:val="28"/>
-          <w:lang w:val="en-US"/>
-          <w14:ligatures w14:val="none"/>
-        </w:rPr>
-      </w:pPr>
-    </w:p>
-    <w:p>
-      <w:pPr>
-        <w:spacing w:after="0" w:line="240" w:lineRule="auto"/>
-        <w:rPr>
-          <w:rFonts w:ascii="Times New Roman" w:eastAsia="Times New Roman" w:hAnsi="Times New Roman" w:cs="Times New Roman"/>
-          <w:kern w:val="0"/>
-          <w:sz w:val="28"/>
-          <w:szCs w:val="28"/>
-          <w:lang w:val="en-US"/>
-          <w14:ligatures w14:val="none"/>
-        </w:rPr>
-      </w:pPr>
-    </w:p>
-    <w:p>
-      <w:pPr>
-        <w:rPr>
-          <w:rFonts w:ascii="Times New Roman" w:hAnsi="Times New Roman" w:cs="Times New Roman"/>
-        </w:rPr>
-      </w:pPr>
-    </w:p>
-    <w:p>
-      <w:pPr>
-        <w:rPr>
-          <w:rFonts w:ascii="Times New Roman" w:hAnsi="Times New Roman" w:cs="Times New Roman"/>
-        </w:rPr>
-      </w:pPr>
-    </w:p>
-    <w:p>
-      <w:pPr>
-        <w:rPr>
-          <w:rFonts w:ascii="Times New Roman" w:hAnsi="Times New Roman" w:cs="Times New Roman"/>
-        </w:rPr>
-      </w:pPr>
-    </w:p>
-    <w:p>
-      <w:pPr>
-        <w:rPr>
-          <w:rFonts w:ascii="Times New Roman" w:hAnsi="Times New Roman" w:cs="Times New Roman"/>
-        </w:rPr>
-      </w:pPr>
-      <w:r>
-        <w:rPr>
-          <w:rFonts w:ascii="Times New Roman" w:hAnsi="Times New Roman" w:cs="Times New Roman"/>
-        </w:rPr>
-        <w:br w:type="page"/>
-      </w:r>
-    </w:p>
-    <w:p>
-      <w:pPr>
-        <w:spacing w:after="0" w:line="240" w:lineRule="auto"/>
-        <w:rPr>
-          <w:rFonts w:ascii="Times New Roman" w:eastAsia="Times New Roman" w:hAnsi="Times New Roman" w:cs="Times New Roman"/>
-          <w:kern w:val="0"/>
-          <w:sz w:val="28"/>
-          <w:szCs w:val="28"/>
-          <w:lang w:val="en-US"/>
-          <w14:ligatures w14:val="none"/>
-        </w:rPr>
-      </w:pPr>
-    </w:p>
-    <w:p>
-      <w:pPr>
-        <w:spacing w:after="0" w:line="240" w:lineRule="auto"/>
-        <w:rPr>
-          <w:rFonts w:ascii="Times New Roman" w:eastAsia="Times New Roman" w:hAnsi="Times New Roman" w:cs="Times New Roman"/>
-          <w:kern w:val="0"/>
-          <w:sz w:val="28"/>
-          <w:szCs w:val="28"/>
-          <w:lang w:val="en-US"/>
-          <w14:ligatures w14:val="none"/>
-        </w:rPr>
-      </w:pPr>
-      <w:r>
-        <w:rPr>
-          <w:rFonts w:ascii="Times New Roman" w:eastAsia="Times New Roman" w:hAnsi="Times New Roman" w:cs="Times New Roman"/>
-          <w:kern w:val="0"/>
-          <w:sz w:val="28"/>
-          <w:szCs w:val="28"/>
-          <w:lang w:val="en-US"/>
-          <w14:ligatures w14:val="none"/>
-        </w:rPr>
-        <w:t>May 14, 2026</w:t>
-      </w:r>
-    </w:p>
-    <w:p>
-      <w:pPr>
-        <w:tabs>
-          <w:tab w:val="left" w:pos="1440"/>
-        </w:tabs>
-        <w:spacing w:after="0" w:line="240" w:lineRule="auto"/>
-        <w:rPr>
-          <w:rFonts w:ascii="Times New Roman" w:eastAsia="Times New Roman" w:hAnsi="Times New Roman" w:cs="Times New Roman"/>
-          <w:kern w:val="0"/>
-          <w:sz w:val="28"/>
-          <w:szCs w:val="28"/>
-          <w:lang w:val="en-US"/>
-          <w14:ligatures w14:val="none"/>
-        </w:rPr>
-      </w:pPr>
-      <w:r>
-        <w:rPr>
-          <w:rFonts w:ascii="Times New Roman" w:eastAsia="Times New Roman" w:hAnsi="Times New Roman" w:cs="Times New Roman"/>
-          <w:kern w:val="0"/>
-          <w:sz w:val="28"/>
-          <w:szCs w:val="28"/>
-          <w:lang w:val="en-US"/>
-          <w14:ligatures w14:val="none"/>
-        </w:rPr>
-        <w:tab/>
-      </w:r>
-    </w:p>
-    <w:p>
-      <w:pPr>
-        <w:spacing w:after="0" w:line="240" w:lineRule="auto"/>
-        <w:rPr>
-          <w:rFonts w:ascii="Times New Roman" w:hAnsi="Times New Roman" w:cs="Times New Roman"/>
-          <w:b/>
-          <w:sz w:val="28"/>
-          <w:szCs w:val="28"/>
-        </w:rPr>
-      </w:pPr>
-      <w:proofErr w:type="spellStart"/>
-      <w:r>
-        <w:rPr>
-          <w:rFonts w:ascii="Times New Roman" w:hAnsi="Times New Roman" w:cs="Times New Roman"/>
-          <w:b/>
-          <w:sz w:val="28"/>
-          <w:szCs w:val="28"/>
-        </w:rPr>
-        <w:t>Coun</w:t>
-      </w:r>
-      <w:proofErr w:type="spellEnd"/>
-      <w:r>
-        <w:rPr>
-          <w:rFonts w:ascii="Times New Roman" w:hAnsi="Times New Roman" w:cs="Times New Roman"/>
-          <w:b/>
-          <w:sz w:val="28"/>
-          <w:szCs w:val="28"/>
-        </w:rPr>
-        <w:t xml:space="preserve">. Wilbert </w:t>
-      </w:r>
-      <w:proofErr w:type="spellStart"/>
-      <w:r>
-        <w:rPr>
-          <w:rFonts w:ascii="Times New Roman" w:hAnsi="Times New Roman" w:cs="Times New Roman"/>
-          <w:b/>
-          <w:sz w:val="28"/>
-          <w:szCs w:val="28"/>
-        </w:rPr>
-        <w:t>Mckinley</w:t>
-      </w:r>
-      <w:proofErr w:type="spellEnd"/>
-      <w:r>
-        <w:rPr>
-          <w:rFonts w:ascii="Times New Roman" w:hAnsi="Times New Roman" w:cs="Times New Roman"/>
-          <w:b/>
-          <w:sz w:val="28"/>
-          <w:szCs w:val="28"/>
-        </w:rPr>
-        <w:t xml:space="preserve"> </w:t>
-      </w:r>
-      <w:proofErr w:type="spellStart"/>
-      <w:r>
-        <w:rPr>
-          <w:rFonts w:ascii="Times New Roman" w:hAnsi="Times New Roman" w:cs="Times New Roman"/>
-          <w:b/>
-          <w:sz w:val="28"/>
-          <w:szCs w:val="28"/>
-        </w:rPr>
-        <w:t>Noche</w:t>
-      </w:r>
-      <w:proofErr w:type="spellEnd"/>
-    </w:p>
-    <w:p>
-      <w:pPr>
-        <w:spacing w:after="0" w:line="240" w:lineRule="auto"/>
-        <w:rPr>
-          <w:rFonts w:ascii="Times New Roman" w:hAnsi="Times New Roman" w:cs="Times New Roman"/>
-          <w:bCs/>
-          <w:sz w:val="28"/>
-          <w:szCs w:val="28"/>
-        </w:rPr>
-      </w:pPr>
-      <w:r>
-        <w:rPr>
-          <w:rFonts w:ascii="Times New Roman" w:hAnsi="Times New Roman" w:cs="Times New Roman"/>
-          <w:bCs/>
-          <w:sz w:val="28"/>
-          <w:szCs w:val="28"/>
-        </w:rPr>
-        <w:t>Ex-Officio Member</w:t>
-      </w:r>
-    </w:p>
-    <w:p>
-      <w:pPr>
-        <w:spacing w:after="0" w:line="240" w:lineRule="auto"/>
-        <w:rPr>
-          <w:rFonts w:ascii="Times New Roman" w:hAnsi="Times New Roman" w:cs="Times New Roman"/>
-          <w:b/>
-          <w:sz w:val="28"/>
-          <w:szCs w:val="28"/>
-        </w:rPr>
-      </w:pPr>
-    </w:p>
-    <w:p>
-      <w:pPr>
-        <w:spacing w:after="0" w:line="240" w:lineRule="auto"/>
-        <w:rPr>
-          <w:rFonts w:ascii="Times New Roman" w:hAnsi="Times New Roman" w:cs="Times New Roman"/>
-          <w:b/>
-          <w:sz w:val="28"/>
-          <w:szCs w:val="28"/>
-        </w:rPr>
-      </w:pPr>
-      <w:r>
-        <w:rPr>
-          <w:rFonts w:ascii="Times New Roman" w:hAnsi="Times New Roman" w:cs="Times New Roman"/>
-          <w:b/>
-          <w:sz w:val="28"/>
-          <w:szCs w:val="28"/>
-        </w:rPr>
-        <w:t xml:space="preserve">Dear </w:t>
-      </w:r>
-      <w:proofErr w:type="spellStart"/>
-      <w:r>
-        <w:rPr>
-          <w:rFonts w:ascii="Times New Roman" w:hAnsi="Times New Roman" w:cs="Times New Roman"/>
-          <w:b/>
-          <w:sz w:val="28"/>
-          <w:szCs w:val="28"/>
-        </w:rPr>
-        <w:t>Coun</w:t>
-      </w:r>
-      <w:proofErr w:type="spellEnd"/>
-      <w:r>
-        <w:rPr>
-          <w:rFonts w:ascii="Times New Roman" w:hAnsi="Times New Roman" w:cs="Times New Roman"/>
-          <w:b/>
-          <w:sz w:val="28"/>
-          <w:szCs w:val="28"/>
-        </w:rPr>
-        <w:t xml:space="preserve">. </w:t>
-      </w:r>
-      <w:proofErr w:type="spellStart"/>
-      <w:r>
-        <w:rPr>
-          <w:rFonts w:ascii="Times New Roman" w:hAnsi="Times New Roman" w:cs="Times New Roman"/>
-          <w:b/>
-          <w:sz w:val="28"/>
-          <w:szCs w:val="28"/>
-        </w:rPr>
-        <w:t>Noche</w:t>
-      </w:r>
-      <w:proofErr w:type="spellEnd"/>
-      <w:r>
-        <w:rPr>
-          <w:rFonts w:ascii="Times New Roman" w:hAnsi="Times New Roman" w:cs="Times New Roman"/>
-          <w:b/>
-          <w:sz w:val="28"/>
-          <w:szCs w:val="28"/>
-        </w:rPr>
-        <w:t>:</w:t>
-      </w:r>
-    </w:p>
-    <w:p>
-      <w:pPr>
-        <w:spacing w:after="0" w:line="240" w:lineRule="auto"/>
-        <w:rPr>
-          <w:rFonts w:ascii="Times New Roman" w:eastAsia="Times New Roman" w:hAnsi="Times New Roman" w:cs="Times New Roman"/>
-          <w:kern w:val="0"/>
-          <w:sz w:val="28"/>
-          <w:szCs w:val="28"/>
-          <w:lang w:val="en-US"/>
-          <w14:ligatures w14:val="none"/>
-        </w:rPr>
-      </w:pPr>
-    </w:p>
-    <w:p>
-      <w:pPr>
-        <w:spacing w:after="0" w:line="240" w:lineRule="auto"/>
-        <w:jc w:val="both"/>
-        <w:rPr>
-          <w:rFonts w:ascii="Times New Roman" w:eastAsia="Times New Roman" w:hAnsi="Times New Roman" w:cs="Times New Roman"/>
-          <w:b/>
-          <w:kern w:val="0"/>
-          <w:sz w:val="28"/>
-          <w:szCs w:val="28"/>
-          <w:lang w:val="en-US"/>
-          <w14:ligatures w14:val="none"/>
-        </w:rPr>
-      </w:pPr>
-      <w:r>
-        <w:rPr>
-          <w:rFonts w:ascii="Times New Roman" w:eastAsia="Times New Roman" w:hAnsi="Times New Roman" w:cs="Times New Roman"/>
-          <w:kern w:val="0"/>
-          <w:sz w:val="28"/>
-          <w:szCs w:val="28"/>
-          <w:lang w:val="en-US"/>
-          <w14:ligatures w14:val="none"/>
-        </w:rPr>
-        <w:t xml:space="preserve">Please be informed that the meeting of the Board of Trustees of the </w:t>
-      </w:r>
-      <w:proofErr w:type="spellStart"/>
-      <w:r>
-        <w:rPr>
-          <w:rFonts w:ascii="Times New Roman" w:eastAsia="Times New Roman" w:hAnsi="Times New Roman" w:cs="Times New Roman"/>
-          <w:kern w:val="0"/>
-          <w:sz w:val="28"/>
-          <w:szCs w:val="28"/>
-          <w:lang w:val="en-US"/>
-          <w14:ligatures w14:val="none"/>
-        </w:rPr>
-        <w:t>Dalubhasaan</w:t>
-      </w:r>
-      <w:proofErr w:type="spellEnd"/>
-      <w:r>
-        <w:rPr>
-          <w:rFonts w:ascii="Times New Roman" w:eastAsia="Times New Roman" w:hAnsi="Times New Roman" w:cs="Times New Roman"/>
-          <w:kern w:val="0"/>
-          <w:sz w:val="28"/>
-          <w:szCs w:val="28"/>
-          <w:lang w:val="en-US"/>
-          <w14:ligatures w14:val="none"/>
-        </w:rPr>
-        <w:t xml:space="preserve"> ng </w:t>
-      </w:r>
-      <w:proofErr w:type="spellStart"/>
-      <w:r>
-        <w:rPr>
-          <w:rFonts w:ascii="Times New Roman" w:eastAsia="Times New Roman" w:hAnsi="Times New Roman" w:cs="Times New Roman"/>
-          <w:kern w:val="0"/>
-          <w:sz w:val="28"/>
-          <w:szCs w:val="28"/>
-          <w:lang w:val="en-US"/>
-          <w14:ligatures w14:val="none"/>
-        </w:rPr>
-        <w:t>Lungsod</w:t>
-      </w:r>
-      <w:proofErr w:type="spellEnd"/>
-      <w:r>
-        <w:rPr>
-          <w:rFonts w:ascii="Times New Roman" w:eastAsia="Times New Roman" w:hAnsi="Times New Roman" w:cs="Times New Roman"/>
-          <w:kern w:val="0"/>
-          <w:sz w:val="28"/>
-          <w:szCs w:val="28"/>
-          <w:lang w:val="en-US"/>
-          <w14:ligatures w14:val="none"/>
-        </w:rPr>
-        <w:t xml:space="preserve"> ng </w:t>
-      </w:r>
-      <w:proofErr w:type="spellStart"/>
-      <w:r>
-        <w:rPr>
-          <w:rFonts w:ascii="Times New Roman" w:eastAsia="Times New Roman" w:hAnsi="Times New Roman" w:cs="Times New Roman"/>
-          <w:kern w:val="0"/>
-          <w:sz w:val="28"/>
-          <w:szCs w:val="28"/>
-          <w:lang w:val="en-US"/>
-          <w14:ligatures w14:val="none"/>
-        </w:rPr>
-        <w:t>Lucena</w:t>
-      </w:r>
-      <w:proofErr w:type="spellEnd"/>
-      <w:r>
-        <w:rPr>
-          <w:rFonts w:ascii="Times New Roman" w:eastAsia="Times New Roman" w:hAnsi="Times New Roman" w:cs="Times New Roman"/>
-          <w:kern w:val="0"/>
-          <w:sz w:val="28"/>
-          <w:szCs w:val="28"/>
-          <w:lang w:val="en-US"/>
-          <w14:ligatures w14:val="none"/>
-        </w:rPr>
-        <w:t xml:space="preserve"> is set on </w:t>
-      </w:r>
-      <w:r>
-        <w:rPr>
-          <w:rFonts w:ascii="Times New Roman" w:eastAsia="Times New Roman" w:hAnsi="Times New Roman" w:cs="Times New Roman"/>
-          <w:b/>
-          <w:bCs/>
-          <w:kern w:val="0"/>
-          <w:sz w:val="28"/>
-          <w:szCs w:val="28"/>
-          <w:lang w:val="en-US"/>
-          <w14:ligatures w14:val="none"/>
-        </w:rPr>
-        <w:t>Tuesday</w:t>
-      </w:r>
-      <w:r>
-        <w:rPr>
-          <w:rFonts w:ascii="Times New Roman" w:eastAsia="Times New Roman" w:hAnsi="Times New Roman" w:cs="Times New Roman"/>
-          <w:b/>
-          <w:kern w:val="0"/>
-          <w:sz w:val="28"/>
-          <w:szCs w:val="28"/>
-          <w:lang w:val="en-US"/>
-          <w14:ligatures w14:val="none"/>
-        </w:rPr>
-        <w:t xml:space="preserve">, May 19, 2026, 10:30 in the morning at the President’s Office at the </w:t>
-      </w:r>
-      <w:proofErr w:type="spellStart"/>
-      <w:r>
-        <w:rPr>
-          <w:rFonts w:ascii="Times New Roman" w:eastAsia="Times New Roman" w:hAnsi="Times New Roman" w:cs="Times New Roman"/>
-          <w:b/>
-          <w:kern w:val="0"/>
-          <w:sz w:val="28"/>
-          <w:szCs w:val="28"/>
-          <w:lang w:val="en-US"/>
-          <w14:ligatures w14:val="none"/>
-        </w:rPr>
-        <w:t>Dalubhasaan</w:t>
-      </w:r>
-      <w:proofErr w:type="spellEnd"/>
-      <w:r>
-        <w:rPr>
-          <w:rFonts w:ascii="Times New Roman" w:eastAsia="Times New Roman" w:hAnsi="Times New Roman" w:cs="Times New Roman"/>
-          <w:b/>
-          <w:kern w:val="0"/>
-          <w:sz w:val="28"/>
-          <w:szCs w:val="28"/>
-          <w:lang w:val="en-US"/>
-          <w14:ligatures w14:val="none"/>
-        </w:rPr>
-        <w:t xml:space="preserve"> ng </w:t>
-      </w:r>
-      <w:proofErr w:type="spellStart"/>
-      <w:r>
-        <w:rPr>
-          <w:rFonts w:ascii="Times New Roman" w:eastAsia="Times New Roman" w:hAnsi="Times New Roman" w:cs="Times New Roman"/>
-          <w:b/>
-          <w:kern w:val="0"/>
-          <w:sz w:val="28"/>
-          <w:szCs w:val="28"/>
-          <w:lang w:val="en-US"/>
-          <w14:ligatures w14:val="none"/>
-        </w:rPr>
-        <w:t>Lungsod</w:t>
-      </w:r>
-      <w:proofErr w:type="spellEnd"/>
-      <w:r>
-        <w:rPr>
-          <w:rFonts w:ascii="Times New Roman" w:eastAsia="Times New Roman" w:hAnsi="Times New Roman" w:cs="Times New Roman"/>
-          <w:b/>
-          <w:kern w:val="0"/>
-          <w:sz w:val="28"/>
-          <w:szCs w:val="28"/>
-          <w:lang w:val="en-US"/>
-          <w14:ligatures w14:val="none"/>
-        </w:rPr>
-        <w:t xml:space="preserve"> ng </w:t>
-      </w:r>
-      <w:proofErr w:type="spellStart"/>
-      <w:r>
-        <w:rPr>
-          <w:rFonts w:ascii="Times New Roman" w:eastAsia="Times New Roman" w:hAnsi="Times New Roman" w:cs="Times New Roman"/>
-          <w:b/>
-          <w:kern w:val="0"/>
-          <w:sz w:val="28"/>
-          <w:szCs w:val="28"/>
-          <w:lang w:val="en-US"/>
-          <w14:ligatures w14:val="none"/>
-        </w:rPr>
-        <w:t>Lucena</w:t>
-      </w:r>
-      <w:proofErr w:type="spellEnd"/>
-      <w:r>
-        <w:rPr>
-          <w:rFonts w:ascii="Times New Roman" w:eastAsia="Times New Roman" w:hAnsi="Times New Roman" w:cs="Times New Roman"/>
-          <w:b/>
-          <w:kern w:val="0"/>
-          <w:sz w:val="28"/>
-          <w:szCs w:val="28"/>
-          <w:lang w:val="en-US"/>
-          <w14:ligatures w14:val="none"/>
-        </w:rPr>
-        <w:t xml:space="preserve"> Administration Office. </w:t>
-      </w:r>
-    </w:p>
-    <w:p>
-      <w:pPr>
-        <w:spacing w:after="0" w:line="240" w:lineRule="auto"/>
-        <w:rPr>
-          <w:rFonts w:ascii="Times New Roman" w:eastAsia="Times New Roman" w:hAnsi="Times New Roman" w:cs="Times New Roman"/>
-          <w:kern w:val="0"/>
-          <w:sz w:val="28"/>
-          <w:szCs w:val="28"/>
-          <w:lang w:val="en-US"/>
-          <w14:ligatures w14:val="none"/>
-        </w:rPr>
-      </w:pPr>
-    </w:p>
-    <w:p>
-      <w:pPr>
-        <w:spacing w:after="0" w:line="240" w:lineRule="auto"/>
-        <w:rPr>
-          <w:rFonts w:ascii="Times New Roman" w:eastAsia="Times New Roman" w:hAnsi="Times New Roman" w:cs="Times New Roman"/>
-          <w:kern w:val="0"/>
-          <w:sz w:val="28"/>
-          <w:szCs w:val="28"/>
-          <w:lang w:val="en-US"/>
-          <w14:ligatures w14:val="none"/>
-        </w:rPr>
-      </w:pPr>
-      <w:r>
-        <w:rPr>
-          <w:rFonts w:ascii="Times New Roman" w:eastAsia="Times New Roman" w:hAnsi="Times New Roman" w:cs="Times New Roman"/>
-          <w:kern w:val="0"/>
-          <w:sz w:val="28"/>
-          <w:szCs w:val="28"/>
-          <w:lang w:val="en-US"/>
-          <w14:ligatures w14:val="none"/>
-        </w:rPr>
-        <w:t>Important matters to be discussed on the said meeting are the following:</w:t>
-      </w:r>
-    </w:p>
-    <w:p>
-      <w:pPr>
-        <w:spacing w:after="0" w:line="240" w:lineRule="auto"/>
-        <w:rPr>
-          <w:rFonts w:ascii="Times New Roman" w:eastAsia="Times New Roman" w:hAnsi="Times New Roman" w:cs="Times New Roman"/>
-          <w:kern w:val="0"/>
-          <w:sz w:val="28"/>
-          <w:szCs w:val="28"/>
-          <w:lang w:val="en-US"/>
-          <w14:ligatures w14:val="none"/>
-        </w:rPr>
-      </w:pPr>
+        <w:t xml:space="preserve">Budget for Commencement </w:t>
+      </w:r>
+      <w:r>
+        <w:rPr>
+          <w:rFonts w:ascii="Times New Roman" w:eastAsia="Times New Roman" w:hAnsi="Times New Roman" w:cs="Times New Roman"/>
+          <w:kern w:val="0"/>
+          <w:sz w:val="28"/>
+          <w:szCs w:val="28"/>
+          <w:lang w:val="en-US"/>
+          <w14:ligatures w14:val="none"/>
+        </w:rPr>
+        <w:t>Rites</w:t>
+      </w:r>
+      <w:r>
+        <w:rPr>
+          <w:rFonts w:ascii="Times New Roman" w:eastAsia="Times New Roman" w:hAnsi="Times New Roman" w:cs="Times New Roman"/>
+          <w:kern w:val="0"/>
+          <w:sz w:val="28"/>
+          <w:szCs w:val="28"/>
+          <w:lang w:val="en-US"/>
+          <w14:ligatures w14:val="none"/>
+        </w:rPr>
+        <w:t xml:space="preserve"> 2026</w:t>
+      </w:r>
     </w:p>
     <w:p>
       <w:pPr>
@@ -2117,7 +1431,18 @@
           <w:lang w:val="en-US"/>
           <w14:ligatures w14:val="none"/>
         </w:rPr>
-        <w:t>Deliberation and Conferment of Graduating Students</w:t>
+        <w:t>Other Matters</w:t>
+      </w:r>
+      <w:r>
+        <w:rPr>
+          <w:rFonts w:ascii="Times New Roman" w:eastAsia="Times New Roman" w:hAnsi="Times New Roman" w:cs="Times New Roman"/>
+          <w:kern w:val="0"/>
+          <w:sz w:val="28"/>
+          <w:szCs w:val="28"/>
+          <w:lang w:val="en-US"/>
+          <w14:ligatures w14:val="none"/>
+        </w:rPr>
+        <w:t xml:space="preserve"> </w:t>
       </w:r>
     </w:p>
     <w:p>
@@ -2145,8 +1470,725 @@
           <w:lang w:val="en-US"/>
           <w14:ligatures w14:val="none"/>
         </w:rPr>
-        <w:t>Budget for Commencement Rights 2026</w:t>
-      </w:r>
+        <w:t>Board Chairman’s Time</w:t>
+      </w:r>
+    </w:p>
+    <w:p>
+      <w:pPr>
+        <w:spacing w:after="0" w:line="240" w:lineRule="auto"/>
+        <w:rPr>
+          <w:rFonts w:ascii="Times New Roman" w:eastAsia="Times New Roman" w:hAnsi="Times New Roman" w:cs="Times New Roman"/>
+          <w:kern w:val="0"/>
+          <w:sz w:val="28"/>
+          <w:szCs w:val="28"/>
+          <w:lang w:val="en-US"/>
+          <w14:ligatures w14:val="none"/>
+        </w:rPr>
+      </w:pPr>
+    </w:p>
+    <w:p>
+      <w:pPr>
+        <w:spacing w:after="0" w:line="240" w:lineRule="auto"/>
+        <w:rPr>
+          <w:rFonts w:ascii="Times New Roman" w:eastAsia="Times New Roman" w:hAnsi="Times New Roman" w:cs="Times New Roman"/>
+          <w:kern w:val="0"/>
+          <w:sz w:val="28"/>
+          <w:szCs w:val="28"/>
+          <w:lang w:val="en-US"/>
+          <w14:ligatures w14:val="none"/>
+        </w:rPr>
+      </w:pPr>
+      <w:r>
+        <w:rPr>
+          <w:rFonts w:ascii="Times New Roman" w:eastAsia="Times New Roman" w:hAnsi="Times New Roman" w:cs="Times New Roman"/>
+          <w:kern w:val="0"/>
+          <w:sz w:val="28"/>
+          <w:szCs w:val="28"/>
+          <w:lang w:val="en-US"/>
+          <w14:ligatures w14:val="none"/>
+        </w:rPr>
+        <w:t>We highly appreciate your personal presence in the said meeting. Thank you very much.</w:t>
+      </w:r>
+    </w:p>
+    <w:p>
+      <w:pPr>
+        <w:spacing w:after="0" w:line="240" w:lineRule="auto"/>
+        <w:rPr>
+          <w:rFonts w:ascii="Times New Roman" w:eastAsia="Times New Roman" w:hAnsi="Times New Roman" w:cs="Times New Roman"/>
+          <w:kern w:val="0"/>
+          <w:sz w:val="28"/>
+          <w:szCs w:val="28"/>
+          <w:lang w:val="en-US"/>
+          <w14:ligatures w14:val="none"/>
+        </w:rPr>
+      </w:pPr>
+    </w:p>
+    <w:p>
+      <w:pPr>
+        <w:spacing w:after="0" w:line="240" w:lineRule="auto"/>
+        <w:rPr>
+          <w:rFonts w:ascii="Times New Roman" w:eastAsia="Times New Roman" w:hAnsi="Times New Roman" w:cs="Times New Roman"/>
+          <w:kern w:val="0"/>
+          <w:sz w:val="28"/>
+          <w:szCs w:val="28"/>
+          <w:lang w:val="en-US"/>
+          <w14:ligatures w14:val="none"/>
+        </w:rPr>
+      </w:pPr>
+      <w:r>
+        <w:rPr>
+          <w:rFonts w:ascii="Times New Roman" w:eastAsia="Times New Roman" w:hAnsi="Times New Roman" w:cs="Times New Roman"/>
+          <w:kern w:val="0"/>
+          <w:sz w:val="28"/>
+          <w:szCs w:val="28"/>
+          <w:lang w:val="en-US"/>
+          <w14:ligatures w14:val="none"/>
+        </w:rPr>
+        <w:t>Very truly yours,</w:t>
+      </w:r>
+    </w:p>
+    <w:p>
+      <w:pPr>
+        <w:spacing w:after="0" w:line="240" w:lineRule="auto"/>
+        <w:rPr>
+          <w:rFonts w:ascii="Times New Roman" w:eastAsia="Times New Roman" w:hAnsi="Times New Roman" w:cs="Times New Roman"/>
+          <w:kern w:val="0"/>
+          <w:sz w:val="28"/>
+          <w:szCs w:val="28"/>
+          <w:lang w:val="en-US"/>
+          <w14:ligatures w14:val="none"/>
+        </w:rPr>
+      </w:pPr>
+    </w:p>
+    <w:p>
+      <w:pPr>
+        <w:spacing w:after="0" w:line="240" w:lineRule="auto"/>
+        <w:rPr>
+          <w:rFonts w:ascii="Times New Roman" w:eastAsia="Times New Roman" w:hAnsi="Times New Roman" w:cs="Times New Roman"/>
+          <w:kern w:val="0"/>
+          <w:sz w:val="28"/>
+          <w:szCs w:val="28"/>
+          <w:lang w:val="en-US"/>
+          <w14:ligatures w14:val="none"/>
+        </w:rPr>
+      </w:pPr>
+    </w:p>
+    <w:p>
+      <w:pPr>
+        <w:spacing w:after="0" w:line="240" w:lineRule="auto"/>
+        <w:rPr>
+          <w:rFonts w:ascii="Times New Roman" w:eastAsia="Times New Roman" w:hAnsi="Times New Roman" w:cs="Times New Roman"/>
+          <w:kern w:val="0"/>
+          <w:sz w:val="28"/>
+          <w:szCs w:val="28"/>
+          <w:lang w:val="en-US"/>
+          <w14:ligatures w14:val="none"/>
+        </w:rPr>
+      </w:pPr>
+    </w:p>
+    <w:p>
+      <w:pPr>
+        <w:spacing w:after="0" w:line="240" w:lineRule="auto"/>
+        <w:rPr>
+          <w:rFonts w:ascii="Times New Roman" w:eastAsia="Times New Roman" w:hAnsi="Times New Roman" w:cs="Times New Roman"/>
+          <w:b/>
+          <w:kern w:val="0"/>
+          <w:sz w:val="28"/>
+          <w:szCs w:val="28"/>
+          <w:lang w:val="en-US"/>
+          <w14:ligatures w14:val="none"/>
+        </w:rPr>
+      </w:pPr>
+      <w:r>
+        <w:rPr>
+          <w:rFonts w:ascii="Times New Roman" w:eastAsia="Times New Roman" w:hAnsi="Times New Roman" w:cs="Times New Roman"/>
+          <w:b/>
+          <w:kern w:val="0"/>
+          <w:sz w:val="28"/>
+          <w:szCs w:val="28"/>
+          <w:lang w:val="en-US"/>
+          <w14:ligatures w14:val="none"/>
+        </w:rPr>
+        <w:t xml:space="preserve">Hon. MARK DON VICTOR B. ALCALA </w:t>
+      </w:r>
+    </w:p>
+    <w:p>
+      <w:pPr>
+        <w:spacing w:after="0" w:line="240" w:lineRule="auto"/>
+        <w:rPr>
+          <w:rFonts w:ascii="Times New Roman" w:eastAsia="Times New Roman" w:hAnsi="Times New Roman" w:cs="Times New Roman"/>
+          <w:kern w:val="0"/>
+          <w:sz w:val="28"/>
+          <w:szCs w:val="28"/>
+          <w:lang w:val="en-US"/>
+          <w14:ligatures w14:val="none"/>
+        </w:rPr>
+      </w:pPr>
+      <w:r>
+        <w:rPr>
+          <w:rFonts w:ascii="Times New Roman" w:eastAsia="Times New Roman" w:hAnsi="Times New Roman" w:cs="Times New Roman"/>
+          <w:kern w:val="0"/>
+          <w:sz w:val="28"/>
+          <w:szCs w:val="28"/>
+          <w:lang w:val="en-US"/>
+          <w14:ligatures w14:val="none"/>
+        </w:rPr>
+        <w:t>Chairman, Board of Trustees</w:t>
+      </w:r>
+    </w:p>
+    <w:p>
+      <w:pPr>
+        <w:spacing w:after="0" w:line="240" w:lineRule="auto"/>
+        <w:rPr>
+          <w:rFonts w:ascii="Times New Roman" w:eastAsia="Times New Roman" w:hAnsi="Times New Roman" w:cs="Times New Roman"/>
+          <w:kern w:val="0"/>
+          <w:sz w:val="28"/>
+          <w:szCs w:val="28"/>
+          <w:lang w:val="en-US"/>
+          <w14:ligatures w14:val="none"/>
+        </w:rPr>
+      </w:pPr>
+    </w:p>
+    <w:p>
+      <w:pPr>
+        <w:spacing w:after="0" w:line="240" w:lineRule="auto"/>
+        <w:rPr>
+          <w:rFonts w:ascii="Times New Roman" w:eastAsia="Times New Roman" w:hAnsi="Times New Roman" w:cs="Times New Roman"/>
+          <w:kern w:val="0"/>
+          <w:sz w:val="28"/>
+          <w:szCs w:val="28"/>
+          <w:lang w:val="en-US"/>
+          <w14:ligatures w14:val="none"/>
+        </w:rPr>
+      </w:pPr>
+    </w:p>
+    <w:p>
+      <w:pPr>
+        <w:spacing w:after="0" w:line="240" w:lineRule="auto"/>
+        <w:rPr>
+          <w:rFonts w:ascii="Times New Roman" w:eastAsia="Times New Roman" w:hAnsi="Times New Roman" w:cs="Times New Roman"/>
+          <w:kern w:val="0"/>
+          <w:sz w:val="28"/>
+          <w:szCs w:val="28"/>
+          <w:lang w:val="en-US"/>
+          <w14:ligatures w14:val="none"/>
+        </w:rPr>
+      </w:pPr>
+    </w:p>
+    <w:p>
+      <w:pPr>
+        <w:rPr>
+          <w:rFonts w:ascii="Times New Roman" w:hAnsi="Times New Roman" w:cs="Times New Roman"/>
+        </w:rPr>
+      </w:pPr>
+    </w:p>
+    <w:p>
+      <w:pPr>
+        <w:rPr>
+          <w:rFonts w:ascii="Times New Roman" w:hAnsi="Times New Roman" w:cs="Times New Roman"/>
+        </w:rPr>
+      </w:pPr>
+    </w:p>
+    <w:p>
+      <w:pPr>
+        <w:rPr>
+          <w:rFonts w:ascii="Times New Roman" w:hAnsi="Times New Roman" w:cs="Times New Roman"/>
+        </w:rPr>
+      </w:pPr>
+    </w:p>
+    <w:p>
+      <w:pPr>
+        <w:rPr>
+          <w:rFonts w:ascii="Times New Roman" w:hAnsi="Times New Roman" w:cs="Times New Roman"/>
+        </w:rPr>
+      </w:pPr>
+      <w:r>
+        <w:rPr>
+          <w:rFonts w:ascii="Times New Roman" w:hAnsi="Times New Roman" w:cs="Times New Roman"/>
+        </w:rPr>
+        <w:br w:type="page"/>
+      </w:r>
+    </w:p>
+    <w:p>
+      <w:pPr>
+        <w:spacing w:after="0" w:line="240" w:lineRule="auto"/>
+        <w:rPr>
+          <w:rFonts w:ascii="Times New Roman" w:eastAsia="Times New Roman" w:hAnsi="Times New Roman" w:cs="Times New Roman"/>
+          <w:kern w:val="0"/>
+          <w:sz w:val="28"/>
+          <w:szCs w:val="28"/>
+          <w:lang w:val="en-US"/>
+          <w14:ligatures w14:val="none"/>
+        </w:rPr>
+      </w:pPr>
+    </w:p>
+    <w:p>
+      <w:pPr>
+        <w:spacing w:after="0" w:line="240" w:lineRule="auto"/>
+        <w:rPr>
+          <w:rFonts w:ascii="Times New Roman" w:eastAsia="Times New Roman" w:hAnsi="Times New Roman" w:cs="Times New Roman"/>
+          <w:kern w:val="0"/>
+          <w:sz w:val="28"/>
+          <w:szCs w:val="28"/>
+          <w:lang w:val="en-US"/>
+          <w14:ligatures w14:val="none"/>
+        </w:rPr>
+      </w:pPr>
+      <w:r>
+        <w:rPr>
+          <w:rFonts w:ascii="Times New Roman" w:eastAsia="Times New Roman" w:hAnsi="Times New Roman" w:cs="Times New Roman"/>
+          <w:kern w:val="0"/>
+          <w:sz w:val="28"/>
+          <w:szCs w:val="28"/>
+          <w:lang w:val="en-US"/>
+          <w14:ligatures w14:val="none"/>
+        </w:rPr>
+        <w:t>May 14, 2026</w:t>
+      </w:r>
+    </w:p>
+    <w:p>
+      <w:pPr>
+        <w:tabs>
+          <w:tab w:val="left" w:pos="1440"/>
+        </w:tabs>
+        <w:spacing w:after="0" w:line="240" w:lineRule="auto"/>
+        <w:rPr>
+          <w:rFonts w:ascii="Times New Roman" w:eastAsia="Times New Roman" w:hAnsi="Times New Roman" w:cs="Times New Roman"/>
+          <w:kern w:val="0"/>
+          <w:sz w:val="28"/>
+          <w:szCs w:val="28"/>
+          <w:lang w:val="en-US"/>
+          <w14:ligatures w14:val="none"/>
+        </w:rPr>
+      </w:pPr>
+      <w:r>
+        <w:rPr>
+          <w:rFonts w:ascii="Times New Roman" w:eastAsia="Times New Roman" w:hAnsi="Times New Roman" w:cs="Times New Roman"/>
+          <w:kern w:val="0"/>
+          <w:sz w:val="28"/>
+          <w:szCs w:val="28"/>
+          <w:lang w:val="en-US"/>
+          <w14:ligatures w14:val="none"/>
+        </w:rPr>
+        <w:tab/>
+      </w:r>
+    </w:p>
+    <w:p>
+      <w:pPr>
+        <w:spacing w:after="0" w:line="240" w:lineRule="auto"/>
+        <w:rPr>
+          <w:rFonts w:ascii="Times New Roman" w:hAnsi="Times New Roman" w:cs="Times New Roman"/>
+          <w:b/>
+          <w:sz w:val="28"/>
+          <w:szCs w:val="28"/>
+        </w:rPr>
+      </w:pPr>
+      <w:proofErr w:type="spellStart"/>
+      <w:r>
+        <w:rPr>
+          <w:rFonts w:ascii="Times New Roman" w:hAnsi="Times New Roman" w:cs="Times New Roman"/>
+          <w:b/>
+          <w:sz w:val="28"/>
+          <w:szCs w:val="28"/>
+        </w:rPr>
+        <w:t>Coun</w:t>
+      </w:r>
+      <w:proofErr w:type="spellEnd"/>
+      <w:r>
+        <w:rPr>
+          <w:rFonts w:ascii="Times New Roman" w:hAnsi="Times New Roman" w:cs="Times New Roman"/>
+          <w:b/>
+          <w:sz w:val="28"/>
+          <w:szCs w:val="28"/>
+        </w:rPr>
+        <w:t xml:space="preserve">. Wilbert </w:t>
+      </w:r>
+      <w:proofErr w:type="spellStart"/>
+      <w:r>
+        <w:rPr>
+          <w:rFonts w:ascii="Times New Roman" w:hAnsi="Times New Roman" w:cs="Times New Roman"/>
+          <w:b/>
+          <w:sz w:val="28"/>
+          <w:szCs w:val="28"/>
+        </w:rPr>
+        <w:t>Mckinley</w:t>
+      </w:r>
+      <w:proofErr w:type="spellEnd"/>
+      <w:r>
+        <w:rPr>
+          <w:rFonts w:ascii="Times New Roman" w:hAnsi="Times New Roman" w:cs="Times New Roman"/>
+          <w:b/>
+          <w:sz w:val="28"/>
+          <w:szCs w:val="28"/>
+        </w:rPr>
+        <w:t xml:space="preserve"> </w:t>
+      </w:r>
+      <w:proofErr w:type="spellStart"/>
+      <w:r>
+        <w:rPr>
+          <w:rFonts w:ascii="Times New Roman" w:hAnsi="Times New Roman" w:cs="Times New Roman"/>
+          <w:b/>
+          <w:sz w:val="28"/>
+          <w:szCs w:val="28"/>
+        </w:rPr>
+        <w:t>Noche</w:t>
+      </w:r>
+      <w:proofErr w:type="spellEnd"/>
+    </w:p>
+    <w:p>
+      <w:pPr>
+        <w:spacing w:after="0" w:line="240" w:lineRule="auto"/>
+        <w:rPr>
+          <w:rFonts w:ascii="Times New Roman" w:hAnsi="Times New Roman" w:cs="Times New Roman"/>
+          <w:bCs/>
+          <w:sz w:val="28"/>
+          <w:szCs w:val="28"/>
+        </w:rPr>
+      </w:pPr>
+      <w:r>
+        <w:rPr>
+          <w:rFonts w:ascii="Times New Roman" w:hAnsi="Times New Roman" w:cs="Times New Roman"/>
+          <w:bCs/>
+          <w:sz w:val="28"/>
+          <w:szCs w:val="28"/>
+        </w:rPr>
+        <w:t>Ex-Officio Member</w:t>
+      </w:r>
+    </w:p>
+    <w:p>
+      <w:pPr>
+        <w:spacing w:after="0" w:line="240" w:lineRule="auto"/>
+        <w:rPr>
+          <w:rFonts w:ascii="Times New Roman" w:hAnsi="Times New Roman" w:cs="Times New Roman"/>
+          <w:b/>
+          <w:sz w:val="28"/>
+          <w:szCs w:val="28"/>
+        </w:rPr>
+      </w:pPr>
+    </w:p>
+    <w:p>
+      <w:pPr>
+        <w:spacing w:after="0" w:line="240" w:lineRule="auto"/>
+        <w:rPr>
+          <w:rFonts w:ascii="Times New Roman" w:hAnsi="Times New Roman" w:cs="Times New Roman"/>
+          <w:b/>
+          <w:sz w:val="28"/>
+          <w:szCs w:val="28"/>
+        </w:rPr>
+      </w:pPr>
+      <w:r>
+        <w:rPr>
+          <w:rFonts w:ascii="Times New Roman" w:hAnsi="Times New Roman" w:cs="Times New Roman"/>
+          <w:b/>
+          <w:sz w:val="28"/>
+          <w:szCs w:val="28"/>
+        </w:rPr>
+        <w:t xml:space="preserve">Dear </w:t>
+      </w:r>
+      <w:proofErr w:type="spellStart"/>
+      <w:r>
+        <w:rPr>
+          <w:rFonts w:ascii="Times New Roman" w:hAnsi="Times New Roman" w:cs="Times New Roman"/>
+          <w:b/>
+          <w:sz w:val="28"/>
+          <w:szCs w:val="28"/>
+        </w:rPr>
+        <w:t>Coun</w:t>
+      </w:r>
+      <w:proofErr w:type="spellEnd"/>
+      <w:r>
+        <w:rPr>
+          <w:rFonts w:ascii="Times New Roman" w:hAnsi="Times New Roman" w:cs="Times New Roman"/>
+          <w:b/>
+          <w:sz w:val="28"/>
+          <w:szCs w:val="28"/>
+        </w:rPr>
+        <w:t xml:space="preserve">. </w:t>
+      </w:r>
+      <w:proofErr w:type="spellStart"/>
+      <w:r>
+        <w:rPr>
+          <w:rFonts w:ascii="Times New Roman" w:hAnsi="Times New Roman" w:cs="Times New Roman"/>
+          <w:b/>
+          <w:sz w:val="28"/>
+          <w:szCs w:val="28"/>
+        </w:rPr>
+        <w:t>Noche</w:t>
+      </w:r>
+      <w:proofErr w:type="spellEnd"/>
+      <w:r>
+        <w:rPr>
+          <w:rFonts w:ascii="Times New Roman" w:hAnsi="Times New Roman" w:cs="Times New Roman"/>
+          <w:b/>
+          <w:sz w:val="28"/>
+          <w:szCs w:val="28"/>
+        </w:rPr>
+        <w:t>:</w:t>
+      </w:r>
+    </w:p>
+    <w:p>
+      <w:pPr>
+        <w:spacing w:after="0" w:line="240" w:lineRule="auto"/>
+        <w:rPr>
+          <w:rFonts w:ascii="Times New Roman" w:eastAsia="Times New Roman" w:hAnsi="Times New Roman" w:cs="Times New Roman"/>
+          <w:kern w:val="0"/>
+          <w:sz w:val="28"/>
+          <w:szCs w:val="28"/>
+          <w:lang w:val="en-US"/>
+          <w14:ligatures w14:val="none"/>
+        </w:rPr>
+      </w:pPr>
+    </w:p>
+    <w:p>
+      <w:pPr>
+        <w:spacing w:after="0" w:line="240" w:lineRule="auto"/>
+        <w:jc w:val="both"/>
+        <w:rPr>
+          <w:rFonts w:ascii="Times New Roman" w:eastAsia="Times New Roman" w:hAnsi="Times New Roman" w:cs="Times New Roman"/>
+          <w:b/>
+          <w:kern w:val="0"/>
+          <w:sz w:val="28"/>
+          <w:szCs w:val="28"/>
+          <w:lang w:val="en-US"/>
+          <w14:ligatures w14:val="none"/>
+        </w:rPr>
+      </w:pPr>
+      <w:r>
+        <w:rPr>
+          <w:rFonts w:ascii="Times New Roman" w:eastAsia="Times New Roman" w:hAnsi="Times New Roman" w:cs="Times New Roman"/>
+          <w:kern w:val="0"/>
+          <w:sz w:val="28"/>
+          <w:szCs w:val="28"/>
+          <w:lang w:val="en-US"/>
+          <w14:ligatures w14:val="none"/>
+        </w:rPr>
+        <w:t xml:space="preserve">Please be informed that the meeting of the Board of Trustees of the </w:t>
+      </w:r>
+      <w:proofErr w:type="spellStart"/>
+      <w:r>
+        <w:rPr>
+          <w:rFonts w:ascii="Times New Roman" w:eastAsia="Times New Roman" w:hAnsi="Times New Roman" w:cs="Times New Roman"/>
+          <w:kern w:val="0"/>
+          <w:sz w:val="28"/>
+          <w:szCs w:val="28"/>
+          <w:lang w:val="en-US"/>
+          <w14:ligatures w14:val="none"/>
+        </w:rPr>
+        <w:t>Dalubhasaan</w:t>
+      </w:r>
+      <w:proofErr w:type="spellEnd"/>
+      <w:r>
+        <w:rPr>
+          <w:rFonts w:ascii="Times New Roman" w:eastAsia="Times New Roman" w:hAnsi="Times New Roman" w:cs="Times New Roman"/>
+          <w:kern w:val="0"/>
+          <w:sz w:val="28"/>
+          <w:szCs w:val="28"/>
+          <w:lang w:val="en-US"/>
+          <w14:ligatures w14:val="none"/>
+        </w:rPr>
+        <w:t xml:space="preserve"> ng </w:t>
+      </w:r>
+      <w:proofErr w:type="spellStart"/>
+      <w:r>
+        <w:rPr>
+          <w:rFonts w:ascii="Times New Roman" w:eastAsia="Times New Roman" w:hAnsi="Times New Roman" w:cs="Times New Roman"/>
+          <w:kern w:val="0"/>
+          <w:sz w:val="28"/>
+          <w:szCs w:val="28"/>
+          <w:lang w:val="en-US"/>
+          <w14:ligatures w14:val="none"/>
+        </w:rPr>
+        <w:t>Lungsod</w:t>
+      </w:r>
+      <w:proofErr w:type="spellEnd"/>
+      <w:r>
+        <w:rPr>
+          <w:rFonts w:ascii="Times New Roman" w:eastAsia="Times New Roman" w:hAnsi="Times New Roman" w:cs="Times New Roman"/>
+          <w:kern w:val="0"/>
+          <w:sz w:val="28"/>
+          <w:szCs w:val="28"/>
+          <w:lang w:val="en-US"/>
+          <w14:ligatures w14:val="none"/>
+        </w:rPr>
+        <w:t xml:space="preserve"> ng </w:t>
+      </w:r>
+      <w:proofErr w:type="spellStart"/>
+      <w:r>
+        <w:rPr>
+          <w:rFonts w:ascii="Times New Roman" w:eastAsia="Times New Roman" w:hAnsi="Times New Roman" w:cs="Times New Roman"/>
+          <w:kern w:val="0"/>
+          <w:sz w:val="28"/>
+          <w:szCs w:val="28"/>
+          <w:lang w:val="en-US"/>
+          <w14:ligatures w14:val="none"/>
+        </w:rPr>
+        <w:t>Lucena</w:t>
+      </w:r>
+      <w:proofErr w:type="spellEnd"/>
+      <w:r>
+        <w:rPr>
+          <w:rFonts w:ascii="Times New Roman" w:eastAsia="Times New Roman" w:hAnsi="Times New Roman" w:cs="Times New Roman"/>
+          <w:kern w:val="0"/>
+          <w:sz w:val="28"/>
+          <w:szCs w:val="28"/>
+          <w:lang w:val="en-US"/>
+          <w14:ligatures w14:val="none"/>
+        </w:rPr>
+        <w:t xml:space="preserve"> is set on </w:t>
+      </w:r>
+      <w:r>
+        <w:rPr>
+          <w:rFonts w:ascii="Times New Roman" w:eastAsia="Times New Roman" w:hAnsi="Times New Roman" w:cs="Times New Roman"/>
+          <w:b/>
+          <w:bCs/>
+          <w:kern w:val="0"/>
+          <w:sz w:val="28"/>
+          <w:szCs w:val="28"/>
+          <w:lang w:val="en-US"/>
+          <w14:ligatures w14:val="none"/>
+        </w:rPr>
+        <w:t>Tuesday</w:t>
+      </w:r>
+      <w:r>
+        <w:rPr>
+          <w:rFonts w:ascii="Times New Roman" w:eastAsia="Times New Roman" w:hAnsi="Times New Roman" w:cs="Times New Roman"/>
+          <w:b/>
+          <w:kern w:val="0"/>
+          <w:sz w:val="28"/>
+          <w:szCs w:val="28"/>
+          <w:lang w:val="en-US"/>
+          <w14:ligatures w14:val="none"/>
+        </w:rPr>
+        <w:t xml:space="preserve">, May 19, 2026, 10:30 in the morning at the President’s Office at the </w:t>
+      </w:r>
+      <w:proofErr w:type="spellStart"/>
+      <w:r>
+        <w:rPr>
+          <w:rFonts w:ascii="Times New Roman" w:eastAsia="Times New Roman" w:hAnsi="Times New Roman" w:cs="Times New Roman"/>
+          <w:b/>
+          <w:kern w:val="0"/>
+          <w:sz w:val="28"/>
+          <w:szCs w:val="28"/>
+          <w:lang w:val="en-US"/>
+          <w14:ligatures w14:val="none"/>
+        </w:rPr>
+        <w:t>Dalubhasaan</w:t>
+      </w:r>
+      <w:proofErr w:type="spellEnd"/>
+      <w:r>
+        <w:rPr>
+          <w:rFonts w:ascii="Times New Roman" w:eastAsia="Times New Roman" w:hAnsi="Times New Roman" w:cs="Times New Roman"/>
+          <w:b/>
+          <w:kern w:val="0"/>
+          <w:sz w:val="28"/>
+          <w:szCs w:val="28"/>
+          <w:lang w:val="en-US"/>
+          <w14:ligatures w14:val="none"/>
+        </w:rPr>
+        <w:t xml:space="preserve"> ng </w:t>
+      </w:r>
+      <w:proofErr w:type="spellStart"/>
+      <w:r>
+        <w:rPr>
+          <w:rFonts w:ascii="Times New Roman" w:eastAsia="Times New Roman" w:hAnsi="Times New Roman" w:cs="Times New Roman"/>
+          <w:b/>
+          <w:kern w:val="0"/>
+          <w:sz w:val="28"/>
+          <w:szCs w:val="28"/>
+          <w:lang w:val="en-US"/>
+          <w14:ligatures w14:val="none"/>
+        </w:rPr>
+        <w:t>Lungsod</w:t>
+      </w:r>
+      <w:proofErr w:type="spellEnd"/>
+      <w:r>
+        <w:rPr>
+          <w:rFonts w:ascii="Times New Roman" w:eastAsia="Times New Roman" w:hAnsi="Times New Roman" w:cs="Times New Roman"/>
+          <w:b/>
+          <w:kern w:val="0"/>
+          <w:sz w:val="28"/>
+          <w:szCs w:val="28"/>
+          <w:lang w:val="en-US"/>
+          <w14:ligatures w14:val="none"/>
+        </w:rPr>
+        <w:t xml:space="preserve"> ng </w:t>
+      </w:r>
+      <w:proofErr w:type="spellStart"/>
+      <w:r>
+        <w:rPr>
+          <w:rFonts w:ascii="Times New Roman" w:eastAsia="Times New Roman" w:hAnsi="Times New Roman" w:cs="Times New Roman"/>
+          <w:b/>
+          <w:kern w:val="0"/>
+          <w:sz w:val="28"/>
+          <w:szCs w:val="28"/>
+          <w:lang w:val="en-US"/>
+          <w14:ligatures w14:val="none"/>
+        </w:rPr>
+        <w:t>Lucena</w:t>
+      </w:r>
+      <w:proofErr w:type="spellEnd"/>
+      <w:r>
+        <w:rPr>
+          <w:rFonts w:ascii="Times New Roman" w:eastAsia="Times New Roman" w:hAnsi="Times New Roman" w:cs="Times New Roman"/>
+          <w:b/>
+          <w:kern w:val="0"/>
+          <w:sz w:val="28"/>
+          <w:szCs w:val="28"/>
+          <w:lang w:val="en-US"/>
+          <w14:ligatures w14:val="none"/>
+        </w:rPr>
+        <w:t xml:space="preserve"> Administration Office. </w:t>
+      </w:r>
+    </w:p>
+    <w:p>
+      <w:pPr>
+        <w:spacing w:after="0" w:line="240" w:lineRule="auto"/>
+        <w:rPr>
+          <w:rFonts w:ascii="Times New Roman" w:eastAsia="Times New Roman" w:hAnsi="Times New Roman" w:cs="Times New Roman"/>
+          <w:kern w:val="0"/>
+          <w:sz w:val="28"/>
+          <w:szCs w:val="28"/>
+          <w:lang w:val="en-US"/>
+          <w14:ligatures w14:val="none"/>
+        </w:rPr>
+      </w:pPr>
+    </w:p>
+    <w:p>
+      <w:pPr>
+        <w:spacing w:after="0" w:line="240" w:lineRule="auto"/>
+        <w:rPr>
+          <w:rFonts w:ascii="Times New Roman" w:eastAsia="Times New Roman" w:hAnsi="Times New Roman" w:cs="Times New Roman"/>
+          <w:kern w:val="0"/>
+          <w:sz w:val="28"/>
+          <w:szCs w:val="28"/>
+          <w:lang w:val="en-US"/>
+          <w14:ligatures w14:val="none"/>
+        </w:rPr>
+      </w:pPr>
+      <w:r>
+        <w:rPr>
+          <w:rFonts w:ascii="Times New Roman" w:eastAsia="Times New Roman" w:hAnsi="Times New Roman" w:cs="Times New Roman"/>
+          <w:kern w:val="0"/>
+          <w:sz w:val="28"/>
+          <w:szCs w:val="28"/>
+          <w:lang w:val="en-US"/>
+          <w14:ligatures w14:val="none"/>
+        </w:rPr>
+        <w:t>Important matters to be discussed on the said meeting are the following:</w:t>
+      </w:r>
+    </w:p>
+    <w:p>
+      <w:pPr>
+        <w:spacing w:after="0" w:line="240" w:lineRule="auto"/>
+        <w:rPr>
+          <w:rFonts w:ascii="Times New Roman" w:eastAsia="Times New Roman" w:hAnsi="Times New Roman" w:cs="Times New Roman"/>
+          <w:kern w:val="0"/>
+          <w:sz w:val="28"/>
+          <w:szCs w:val="28"/>
+          <w:lang w:val="en-US"/>
+          <w14:ligatures w14:val="none"/>
+        </w:rPr>
+      </w:pPr>
     </w:p>
     <w:p>
       <w:pPr>
@@ -2173,615 +2215,8 @@
           <w:lang w:val="en-US"/>
           <w14:ligatures w14:val="none"/>
         </w:rPr>
-        <w:t>Other Matters</w:t>
-      </w:r>
-      <w:r>
-        <w:rPr>
-          <w:rFonts w:ascii="Times New Roman" w:eastAsia="Times New Roman" w:hAnsi="Times New Roman" w:cs="Times New Roman"/>
-          <w:kern w:val="0"/>
-          <w:sz w:val="28"/>
-          <w:szCs w:val="28"/>
-          <w:lang w:val="en-US"/>
-          <w14:ligatures w14:val="none"/>
-        </w:rPr>
-        <w:t xml:space="preserve"> (Board Chairman’s Time)</w:t>
-      </w:r>
-    </w:p>
-    <w:p>
-      <w:pPr>
-        <w:spacing w:after="0" w:line="240" w:lineRule="auto"/>
-        <w:rPr>
-          <w:rFonts w:ascii="Times New Roman" w:eastAsia="Times New Roman" w:hAnsi="Times New Roman" w:cs="Times New Roman"/>
-          <w:kern w:val="0"/>
-          <w:sz w:val="28"/>
-          <w:szCs w:val="28"/>
-          <w:lang w:val="en-US"/>
-          <w14:ligatures w14:val="none"/>
-        </w:rPr>
-      </w:pPr>
-    </w:p>
-    <w:p>
-      <w:pPr>
-        <w:spacing w:after="0" w:line="240" w:lineRule="auto"/>
-        <w:rPr>
-          <w:rFonts w:ascii="Times New Roman" w:eastAsia="Times New Roman" w:hAnsi="Times New Roman" w:cs="Times New Roman"/>
-          <w:kern w:val="0"/>
-          <w:sz w:val="28"/>
-          <w:szCs w:val="28"/>
-          <w:lang w:val="en-US"/>
-          <w14:ligatures w14:val="none"/>
-        </w:rPr>
-      </w:pPr>
-      <w:r>
-        <w:rPr>
-          <w:rFonts w:ascii="Times New Roman" w:eastAsia="Times New Roman" w:hAnsi="Times New Roman" w:cs="Times New Roman"/>
-          <w:kern w:val="0"/>
-          <w:sz w:val="28"/>
-          <w:szCs w:val="28"/>
-          <w:lang w:val="en-US"/>
-          <w14:ligatures w14:val="none"/>
-        </w:rPr>
-        <w:t>We highly appreciate your personal presence in the said meeting. Thank you very much.</w:t>
-      </w:r>
-    </w:p>
-    <w:p>
-      <w:pPr>
-        <w:spacing w:after="0" w:line="240" w:lineRule="auto"/>
-        <w:rPr>
-          <w:rFonts w:ascii="Times New Roman" w:eastAsia="Times New Roman" w:hAnsi="Times New Roman" w:cs="Times New Roman"/>
-          <w:kern w:val="0"/>
-          <w:sz w:val="28"/>
-          <w:szCs w:val="28"/>
-          <w:lang w:val="en-US"/>
-          <w14:ligatures w14:val="none"/>
-        </w:rPr>
-      </w:pPr>
-    </w:p>
-    <w:p>
-      <w:pPr>
-        <w:spacing w:after="0" w:line="240" w:lineRule="auto"/>
-        <w:rPr>
-          <w:rFonts w:ascii="Times New Roman" w:eastAsia="Times New Roman" w:hAnsi="Times New Roman" w:cs="Times New Roman"/>
-          <w:kern w:val="0"/>
-          <w:sz w:val="28"/>
-          <w:szCs w:val="28"/>
-          <w:lang w:val="en-US"/>
-          <w14:ligatures w14:val="none"/>
-        </w:rPr>
-      </w:pPr>
-      <w:r>
-        <w:rPr>
-          <w:rFonts w:ascii="Times New Roman" w:eastAsia="Times New Roman" w:hAnsi="Times New Roman" w:cs="Times New Roman"/>
-          <w:kern w:val="0"/>
-          <w:sz w:val="28"/>
-          <w:szCs w:val="28"/>
-          <w:lang w:val="en-US"/>
-          <w14:ligatures w14:val="none"/>
-        </w:rPr>
-        <w:t>Very truly yours,</w:t>
-      </w:r>
-    </w:p>
-    <w:p>
-      <w:pPr>
-        <w:spacing w:after="0" w:line="240" w:lineRule="auto"/>
-        <w:rPr>
-          <w:rFonts w:ascii="Times New Roman" w:eastAsia="Times New Roman" w:hAnsi="Times New Roman" w:cs="Times New Roman"/>
-          <w:kern w:val="0"/>
-          <w:sz w:val="28"/>
-          <w:szCs w:val="28"/>
-          <w:lang w:val="en-US"/>
-          <w14:ligatures w14:val="none"/>
-        </w:rPr>
-      </w:pPr>
-    </w:p>
-    <w:p>
-      <w:pPr>
-        <w:spacing w:after="0" w:line="240" w:lineRule="auto"/>
-        <w:rPr>
-          <w:rFonts w:ascii="Times New Roman" w:eastAsia="Times New Roman" w:hAnsi="Times New Roman" w:cs="Times New Roman"/>
-          <w:kern w:val="0"/>
-          <w:sz w:val="28"/>
-          <w:szCs w:val="28"/>
-          <w:lang w:val="en-US"/>
-          <w14:ligatures w14:val="none"/>
-        </w:rPr>
-      </w:pPr>
-    </w:p>
-    <w:p>
-      <w:pPr>
-        <w:spacing w:after="0" w:line="240" w:lineRule="auto"/>
-        <w:rPr>
-          <w:rFonts w:ascii="Times New Roman" w:eastAsia="Times New Roman" w:hAnsi="Times New Roman" w:cs="Times New Roman"/>
-          <w:kern w:val="0"/>
-          <w:sz w:val="28"/>
-          <w:szCs w:val="28"/>
-          <w:lang w:val="en-US"/>
-          <w14:ligatures w14:val="none"/>
-        </w:rPr>
-      </w:pPr>
-    </w:p>
-    <w:p>
-      <w:pPr>
-        <w:spacing w:after="0" w:line="240" w:lineRule="auto"/>
-        <w:rPr>
-          <w:rFonts w:ascii="Times New Roman" w:eastAsia="Times New Roman" w:hAnsi="Times New Roman" w:cs="Times New Roman"/>
-          <w:b/>
-          <w:kern w:val="0"/>
-          <w:sz w:val="28"/>
-          <w:szCs w:val="28"/>
-          <w:lang w:val="en-US"/>
-          <w14:ligatures w14:val="none"/>
-        </w:rPr>
-      </w:pPr>
-      <w:r>
-        <w:rPr>
-          <w:rFonts w:ascii="Times New Roman" w:eastAsia="Times New Roman" w:hAnsi="Times New Roman" w:cs="Times New Roman"/>
-          <w:b/>
-          <w:kern w:val="0"/>
-          <w:sz w:val="28"/>
-          <w:szCs w:val="28"/>
-          <w:lang w:val="en-US"/>
-          <w14:ligatures w14:val="none"/>
-        </w:rPr>
-        <w:t xml:space="preserve">Hon. MARK DON VICTOR B. ALCALA </w:t>
-      </w:r>
-    </w:p>
-    <w:p>
-      <w:pPr>
-        <w:spacing w:after="0" w:line="240" w:lineRule="auto"/>
-        <w:rPr>
-          <w:rFonts w:ascii="Times New Roman" w:eastAsia="Times New Roman" w:hAnsi="Times New Roman" w:cs="Times New Roman"/>
-          <w:kern w:val="0"/>
-          <w:sz w:val="28"/>
-          <w:szCs w:val="28"/>
-          <w:lang w:val="en-US"/>
-          <w14:ligatures w14:val="none"/>
-        </w:rPr>
-      </w:pPr>
-      <w:r>
-        <w:rPr>
-          <w:rFonts w:ascii="Times New Roman" w:eastAsia="Times New Roman" w:hAnsi="Times New Roman" w:cs="Times New Roman"/>
-          <w:kern w:val="0"/>
-          <w:sz w:val="28"/>
-          <w:szCs w:val="28"/>
-          <w:lang w:val="en-US"/>
-          <w14:ligatures w14:val="none"/>
-        </w:rPr>
-        <w:t>Chairman, Board of Trustees</w:t>
-      </w:r>
-    </w:p>
-    <w:p>
-      <w:pPr>
-        <w:rPr>
-          <w:rFonts w:ascii="Times New Roman" w:hAnsi="Times New Roman" w:cs="Times New Roman"/>
-        </w:rPr>
-      </w:pPr>
-    </w:p>
-    <w:p>
-      <w:pPr>
-        <w:rPr>
-          <w:rFonts w:ascii="Times New Roman" w:hAnsi="Times New Roman" w:cs="Times New Roman"/>
-        </w:rPr>
-      </w:pPr>
-    </w:p>
-    <w:p>
-      <w:pPr>
-        <w:rPr>
-          <w:rFonts w:ascii="Times New Roman" w:hAnsi="Times New Roman" w:cs="Times New Roman"/>
-        </w:rPr>
-      </w:pPr>
-      <w:r>
-        <w:rPr>
-          <w:rFonts w:ascii="Times New Roman" w:hAnsi="Times New Roman" w:cs="Times New Roman"/>
-        </w:rPr>
-        <w:br w:type="page"/>
-      </w:r>
-    </w:p>
-    <w:p>
-      <w:pPr>
-        <w:spacing w:after="0" w:line="240" w:lineRule="auto"/>
-        <w:rPr>
-          <w:rFonts w:ascii="Times New Roman" w:eastAsia="Times New Roman" w:hAnsi="Times New Roman" w:cs="Times New Roman"/>
-          <w:kern w:val="0"/>
-          <w:sz w:val="28"/>
-          <w:szCs w:val="28"/>
-          <w:lang w:val="en-US"/>
-          <w14:ligatures w14:val="none"/>
-        </w:rPr>
-      </w:pPr>
-      <w:r>
-        <w:rPr>
-          <w:rFonts w:ascii="Times New Roman" w:eastAsia="Times New Roman" w:hAnsi="Times New Roman" w:cs="Times New Roman"/>
-          <w:kern w:val="0"/>
-          <w:sz w:val="28"/>
-          <w:szCs w:val="28"/>
-          <w:lang w:val="en-US"/>
-          <w14:ligatures w14:val="none"/>
-        </w:rPr>
-        <w:t>May 14, 2026</w:t>
-      </w:r>
-    </w:p>
-    <w:p>
-      <w:pPr>
-        <w:tabs>
-          <w:tab w:val="left" w:pos="1440"/>
-        </w:tabs>
-        <w:spacing w:after="0" w:line="240" w:lineRule="auto"/>
-        <w:rPr>
-          <w:rFonts w:ascii="Times New Roman" w:eastAsia="Times New Roman" w:hAnsi="Times New Roman" w:cs="Times New Roman"/>
-          <w:kern w:val="0"/>
-          <w:sz w:val="28"/>
-          <w:szCs w:val="28"/>
-          <w:lang w:val="en-US"/>
-          <w14:ligatures w14:val="none"/>
-        </w:rPr>
-      </w:pPr>
-      <w:r>
-        <w:rPr>
-          <w:rFonts w:ascii="Times New Roman" w:eastAsia="Times New Roman" w:hAnsi="Times New Roman" w:cs="Times New Roman"/>
-          <w:kern w:val="0"/>
-          <w:sz w:val="28"/>
-          <w:szCs w:val="28"/>
-          <w:lang w:val="en-US"/>
-          <w14:ligatures w14:val="none"/>
-        </w:rPr>
-        <w:tab/>
-      </w:r>
-    </w:p>
-    <w:p>
-      <w:pPr>
-        <w:spacing w:after="0" w:line="240" w:lineRule="auto"/>
-        <w:rPr>
-          <w:rFonts w:ascii="Times New Roman" w:hAnsi="Times New Roman" w:cs="Times New Roman"/>
-          <w:b/>
-          <w:sz w:val="28"/>
-          <w:szCs w:val="28"/>
-        </w:rPr>
-      </w:pPr>
-      <w:r>
-        <w:rPr>
-          <w:rFonts w:ascii="Times New Roman" w:hAnsi="Times New Roman" w:cs="Times New Roman"/>
-          <w:b/>
-          <w:sz w:val="28"/>
-          <w:szCs w:val="28"/>
-        </w:rPr>
-        <w:t xml:space="preserve">Sec. </w:t>
-      </w:r>
-      <w:proofErr w:type="spellStart"/>
-      <w:r>
-        <w:rPr>
-          <w:rFonts w:ascii="Times New Roman" w:hAnsi="Times New Roman" w:cs="Times New Roman"/>
-          <w:b/>
-          <w:sz w:val="28"/>
-          <w:szCs w:val="28"/>
-        </w:rPr>
-        <w:t>Proceso</w:t>
-      </w:r>
-      <w:proofErr w:type="spellEnd"/>
-      <w:r>
-        <w:rPr>
-          <w:rFonts w:ascii="Times New Roman" w:hAnsi="Times New Roman" w:cs="Times New Roman"/>
-          <w:b/>
-          <w:sz w:val="28"/>
-          <w:szCs w:val="28"/>
-        </w:rPr>
-        <w:t xml:space="preserve"> J. Alcala</w:t>
-      </w:r>
-    </w:p>
-    <w:p>
-      <w:pPr>
-        <w:spacing w:after="0" w:line="240" w:lineRule="auto"/>
-        <w:rPr>
-          <w:rFonts w:ascii="Times New Roman" w:hAnsi="Times New Roman" w:cs="Times New Roman"/>
-          <w:bCs/>
-          <w:sz w:val="28"/>
-          <w:szCs w:val="28"/>
-        </w:rPr>
-      </w:pPr>
-      <w:r>
-        <w:rPr>
-          <w:rFonts w:ascii="Times New Roman" w:hAnsi="Times New Roman" w:cs="Times New Roman"/>
-          <w:bCs/>
-          <w:sz w:val="28"/>
-          <w:szCs w:val="28"/>
-        </w:rPr>
-        <w:t>Member</w:t>
-      </w:r>
-    </w:p>
-    <w:p>
-      <w:pPr>
-        <w:spacing w:after="0" w:line="240" w:lineRule="auto"/>
-        <w:rPr>
-          <w:rFonts w:ascii="Times New Roman" w:hAnsi="Times New Roman" w:cs="Times New Roman"/>
-          <w:b/>
-          <w:sz w:val="28"/>
-          <w:szCs w:val="28"/>
-        </w:rPr>
-      </w:pPr>
-    </w:p>
-    <w:p>
-      <w:pPr>
-        <w:spacing w:after="0" w:line="240" w:lineRule="auto"/>
-        <w:rPr>
-          <w:rFonts w:ascii="Times New Roman" w:hAnsi="Times New Roman" w:cs="Times New Roman"/>
-          <w:b/>
-          <w:sz w:val="28"/>
-          <w:szCs w:val="28"/>
-        </w:rPr>
-      </w:pPr>
-      <w:r>
-        <w:rPr>
-          <w:rFonts w:ascii="Times New Roman" w:hAnsi="Times New Roman" w:cs="Times New Roman"/>
-          <w:b/>
-          <w:sz w:val="28"/>
-          <w:szCs w:val="28"/>
-        </w:rPr>
-        <w:t>Dear Sec. Alcala:</w:t>
-      </w:r>
-    </w:p>
-    <w:p>
-      <w:pPr>
-        <w:spacing w:after="0" w:line="240" w:lineRule="auto"/>
-        <w:rPr>
-          <w:rFonts w:ascii="Times New Roman" w:eastAsia="Times New Roman" w:hAnsi="Times New Roman" w:cs="Times New Roman"/>
-          <w:kern w:val="0"/>
-          <w:sz w:val="28"/>
-          <w:szCs w:val="28"/>
-          <w:lang w:val="en-US"/>
-          <w14:ligatures w14:val="none"/>
-        </w:rPr>
-      </w:pPr>
-    </w:p>
-    <w:p>
-      <w:pPr>
-        <w:spacing w:after="0" w:line="240" w:lineRule="auto"/>
-        <w:jc w:val="both"/>
-        <w:rPr>
-          <w:rFonts w:ascii="Times New Roman" w:eastAsia="Times New Roman" w:hAnsi="Times New Roman" w:cs="Times New Roman"/>
-          <w:b/>
-          <w:kern w:val="0"/>
-          <w:sz w:val="28"/>
-          <w:szCs w:val="28"/>
-          <w:lang w:val="en-US"/>
-          <w14:ligatures w14:val="none"/>
-        </w:rPr>
-      </w:pPr>
-      <w:r>
-        <w:rPr>
-          <w:rFonts w:ascii="Times New Roman" w:eastAsia="Times New Roman" w:hAnsi="Times New Roman" w:cs="Times New Roman"/>
-          <w:kern w:val="0"/>
-          <w:sz w:val="28"/>
-          <w:szCs w:val="28"/>
-          <w:lang w:val="en-US"/>
-          <w14:ligatures w14:val="none"/>
-        </w:rPr>
-        <w:t xml:space="preserve">Please be informed that the meeting of the Board of Trustees of the </w:t>
-      </w:r>
-      <w:proofErr w:type="spellStart"/>
-      <w:r>
-        <w:rPr>
-          <w:rFonts w:ascii="Times New Roman" w:eastAsia="Times New Roman" w:hAnsi="Times New Roman" w:cs="Times New Roman"/>
-          <w:kern w:val="0"/>
-          <w:sz w:val="28"/>
-          <w:szCs w:val="28"/>
-          <w:lang w:val="en-US"/>
-          <w14:ligatures w14:val="none"/>
-        </w:rPr>
-        <w:t>Dalubhasaan</w:t>
-      </w:r>
-      <w:proofErr w:type="spellEnd"/>
-      <w:r>
-        <w:rPr>
-          <w:rFonts w:ascii="Times New Roman" w:eastAsia="Times New Roman" w:hAnsi="Times New Roman" w:cs="Times New Roman"/>
-          <w:kern w:val="0"/>
-          <w:sz w:val="28"/>
-          <w:szCs w:val="28"/>
-          <w:lang w:val="en-US"/>
-          <w14:ligatures w14:val="none"/>
-        </w:rPr>
-        <w:t xml:space="preserve"> ng </w:t>
-      </w:r>
-      <w:proofErr w:type="spellStart"/>
-      <w:r>
-        <w:rPr>
-          <w:rFonts w:ascii="Times New Roman" w:eastAsia="Times New Roman" w:hAnsi="Times New Roman" w:cs="Times New Roman"/>
-          <w:kern w:val="0"/>
-          <w:sz w:val="28"/>
-          <w:szCs w:val="28"/>
-          <w:lang w:val="en-US"/>
-          <w14:ligatures w14:val="none"/>
-        </w:rPr>
-        <w:t>Lungsod</w:t>
-      </w:r>
-      <w:proofErr w:type="spellEnd"/>
-      <w:r>
-        <w:rPr>
-          <w:rFonts w:ascii="Times New Roman" w:eastAsia="Times New Roman" w:hAnsi="Times New Roman" w:cs="Times New Roman"/>
-          <w:kern w:val="0"/>
-          <w:sz w:val="28"/>
-          <w:szCs w:val="28"/>
-          <w:lang w:val="en-US"/>
-          <w14:ligatures w14:val="none"/>
-        </w:rPr>
-        <w:t xml:space="preserve"> ng </w:t>
-      </w:r>
-      <w:proofErr w:type="spellStart"/>
-      <w:r>
-        <w:rPr>
-          <w:rFonts w:ascii="Times New Roman" w:eastAsia="Times New Roman" w:hAnsi="Times New Roman" w:cs="Times New Roman"/>
-          <w:kern w:val="0"/>
-          <w:sz w:val="28"/>
-          <w:szCs w:val="28"/>
-          <w:lang w:val="en-US"/>
-          <w14:ligatures w14:val="none"/>
-        </w:rPr>
-        <w:t>Lucena</w:t>
-      </w:r>
-      <w:proofErr w:type="spellEnd"/>
-      <w:r>
-        <w:rPr>
-          <w:rFonts w:ascii="Times New Roman" w:eastAsia="Times New Roman" w:hAnsi="Times New Roman" w:cs="Times New Roman"/>
-          <w:kern w:val="0"/>
-          <w:sz w:val="28"/>
-          <w:szCs w:val="28"/>
-          <w:lang w:val="en-US"/>
-          <w14:ligatures w14:val="none"/>
-        </w:rPr>
-        <w:t xml:space="preserve"> is set on </w:t>
-      </w:r>
-      <w:r>
-        <w:rPr>
-          <w:rFonts w:ascii="Times New Roman" w:eastAsia="Times New Roman" w:hAnsi="Times New Roman" w:cs="Times New Roman"/>
-          <w:b/>
-          <w:bCs/>
-          <w:kern w:val="0"/>
-          <w:sz w:val="28"/>
-          <w:szCs w:val="28"/>
-          <w:lang w:val="en-US"/>
-          <w14:ligatures w14:val="none"/>
-        </w:rPr>
-        <w:t>Tuesday</w:t>
-      </w:r>
-      <w:r>
-        <w:rPr>
-          <w:rFonts w:ascii="Times New Roman" w:eastAsia="Times New Roman" w:hAnsi="Times New Roman" w:cs="Times New Roman"/>
-          <w:b/>
-          <w:kern w:val="0"/>
-          <w:sz w:val="28"/>
-          <w:szCs w:val="28"/>
-          <w:lang w:val="en-US"/>
-          <w14:ligatures w14:val="none"/>
-        </w:rPr>
-        <w:t xml:space="preserve">, May 19, 2026, 10:30 in the morning at the President’s Office at the </w:t>
-      </w:r>
-      <w:proofErr w:type="spellStart"/>
-      <w:r>
-        <w:rPr>
-          <w:rFonts w:ascii="Times New Roman" w:eastAsia="Times New Roman" w:hAnsi="Times New Roman" w:cs="Times New Roman"/>
-          <w:b/>
-          <w:kern w:val="0"/>
-          <w:sz w:val="28"/>
-          <w:szCs w:val="28"/>
-          <w:lang w:val="en-US"/>
-          <w14:ligatures w14:val="none"/>
-        </w:rPr>
-        <w:t>Dalubhasaan</w:t>
-      </w:r>
-      <w:proofErr w:type="spellEnd"/>
-      <w:r>
-        <w:rPr>
-          <w:rFonts w:ascii="Times New Roman" w:eastAsia="Times New Roman" w:hAnsi="Times New Roman" w:cs="Times New Roman"/>
-          <w:b/>
-          <w:kern w:val="0"/>
-          <w:sz w:val="28"/>
-          <w:szCs w:val="28"/>
-          <w:lang w:val="en-US"/>
-          <w14:ligatures w14:val="none"/>
-        </w:rPr>
-        <w:t xml:space="preserve"> ng </w:t>
-      </w:r>
-      <w:proofErr w:type="spellStart"/>
-      <w:r>
-        <w:rPr>
-          <w:rFonts w:ascii="Times New Roman" w:eastAsia="Times New Roman" w:hAnsi="Times New Roman" w:cs="Times New Roman"/>
-          <w:b/>
-          <w:kern w:val="0"/>
-          <w:sz w:val="28"/>
-          <w:szCs w:val="28"/>
-          <w:lang w:val="en-US"/>
-          <w14:ligatures w14:val="none"/>
-        </w:rPr>
-        <w:t>Lungsod</w:t>
-      </w:r>
-      <w:proofErr w:type="spellEnd"/>
-      <w:r>
-        <w:rPr>
-          <w:rFonts w:ascii="Times New Roman" w:eastAsia="Times New Roman" w:hAnsi="Times New Roman" w:cs="Times New Roman"/>
-          <w:b/>
-          <w:kern w:val="0"/>
-          <w:sz w:val="28"/>
-          <w:szCs w:val="28"/>
-          <w:lang w:val="en-US"/>
-          <w14:ligatures w14:val="none"/>
-        </w:rPr>
-        <w:t xml:space="preserve"> ng </w:t>
-      </w:r>
-      <w:proofErr w:type="spellStart"/>
-      <w:r>
-        <w:rPr>
-          <w:rFonts w:ascii="Times New Roman" w:eastAsia="Times New Roman" w:hAnsi="Times New Roman" w:cs="Times New Roman"/>
-          <w:b/>
-          <w:kern w:val="0"/>
-          <w:sz w:val="28"/>
-          <w:szCs w:val="28"/>
-          <w:lang w:val="en-US"/>
-          <w14:ligatures w14:val="none"/>
-        </w:rPr>
-        <w:t>Lucena</w:t>
-      </w:r>
-      <w:proofErr w:type="spellEnd"/>
-      <w:r>
-        <w:rPr>
-          <w:rFonts w:ascii="Times New Roman" w:eastAsia="Times New Roman" w:hAnsi="Times New Roman" w:cs="Times New Roman"/>
-          <w:b/>
-          <w:kern w:val="0"/>
-          <w:sz w:val="28"/>
-          <w:szCs w:val="28"/>
-          <w:lang w:val="en-US"/>
-          <w14:ligatures w14:val="none"/>
-        </w:rPr>
-        <w:t xml:space="preserve"> Administration Office. </w:t>
-      </w:r>
-    </w:p>
-    <w:p>
-      <w:pPr>
-        <w:spacing w:after="0" w:line="240" w:lineRule="auto"/>
-        <w:rPr>
-          <w:rFonts w:ascii="Times New Roman" w:eastAsia="Times New Roman" w:hAnsi="Times New Roman" w:cs="Times New Roman"/>
-          <w:kern w:val="0"/>
-          <w:sz w:val="28"/>
-          <w:szCs w:val="28"/>
-          <w:lang w:val="en-US"/>
-          <w14:ligatures w14:val="none"/>
-        </w:rPr>
-      </w:pPr>
-    </w:p>
-    <w:p>
-      <w:pPr>
-        <w:spacing w:after="0" w:line="240" w:lineRule="auto"/>
-        <w:rPr>
-          <w:rFonts w:ascii="Times New Roman" w:eastAsia="Times New Roman" w:hAnsi="Times New Roman" w:cs="Times New Roman"/>
-          <w:kern w:val="0"/>
-          <w:sz w:val="28"/>
-          <w:szCs w:val="28"/>
-          <w:lang w:val="en-US"/>
-          <w14:ligatures w14:val="none"/>
-        </w:rPr>
-      </w:pPr>
-      <w:r>
-        <w:rPr>
-          <w:rFonts w:ascii="Times New Roman" w:eastAsia="Times New Roman" w:hAnsi="Times New Roman" w:cs="Times New Roman"/>
-          <w:kern w:val="0"/>
-          <w:sz w:val="28"/>
-          <w:szCs w:val="28"/>
-          <w:lang w:val="en-US"/>
-          <w14:ligatures w14:val="none"/>
-        </w:rPr>
-        <w:t>Important matters to be discussed on the said meeting are the following:</w:t>
-      </w:r>
-    </w:p>
-    <w:p>
-      <w:pPr>
-        <w:spacing w:after="0" w:line="240" w:lineRule="auto"/>
-        <w:rPr>
-          <w:rFonts w:ascii="Times New Roman" w:eastAsia="Times New Roman" w:hAnsi="Times New Roman" w:cs="Times New Roman"/>
-          <w:kern w:val="0"/>
-          <w:sz w:val="28"/>
-          <w:szCs w:val="28"/>
-          <w:lang w:val="en-US"/>
-          <w14:ligatures w14:val="none"/>
-        </w:rPr>
-      </w:pPr>
+        <w:t>Deliberation and Conferment of Graduating Students</w:t>
+      </w:r>
     </w:p>
     <w:p>
       <w:pPr>
@@ -2808,7 +2243,29 @@
           <w:lang w:val="en-US"/>
           <w14:ligatures w14:val="none"/>
         </w:rPr>
-        <w:t>Deliberation and Conferment of Graduating Students</w:t>
+        <w:t xml:space="preserve">Budget for Commencement </w:t>
+      </w:r>
+      <w:r>
+        <w:rPr>
+          <w:rFonts w:ascii="Times New Roman" w:eastAsia="Times New Roman" w:hAnsi="Times New Roman" w:cs="Times New Roman"/>
+          <w:kern w:val="0"/>
+          <w:sz w:val="28"/>
+          <w:szCs w:val="28"/>
+          <w:lang w:val="en-US"/>
+          <w14:ligatures w14:val="none"/>
+        </w:rPr>
+        <w:t>Rites</w:t>
+      </w:r>
+      <w:r>
+        <w:rPr>
+          <w:rFonts w:ascii="Times New Roman" w:eastAsia="Times New Roman" w:hAnsi="Times New Roman" w:cs="Times New Roman"/>
+          <w:kern w:val="0"/>
+          <w:sz w:val="28"/>
+          <w:szCs w:val="28"/>
+          <w:lang w:val="en-US"/>
+          <w14:ligatures w14:val="none"/>
+        </w:rPr>
+        <w:t xml:space="preserve"> 2026</w:t>
       </w:r>
     </w:p>
     <w:p>
@@ -2836,7 +2293,18 @@
           <w:lang w:val="en-US"/>
           <w14:ligatures w14:val="none"/>
         </w:rPr>
-        <w:t>Budget for Commencement Rights 2026</w:t>
+        <w:t>Other Matters</w:t>
+      </w:r>
+      <w:r>
+        <w:rPr>
+          <w:rFonts w:ascii="Times New Roman" w:eastAsia="Times New Roman" w:hAnsi="Times New Roman" w:cs="Times New Roman"/>
+          <w:kern w:val="0"/>
+          <w:sz w:val="28"/>
+          <w:szCs w:val="28"/>
+          <w:lang w:val="en-US"/>
+          <w14:ligatures w14:val="none"/>
+        </w:rPr>
+        <w:t xml:space="preserve"> </w:t>
       </w:r>
     </w:p>
     <w:p>
@@ -2864,18 +2332,7 @@
           <w:lang w:val="en-US"/>
           <w14:ligatures w14:val="none"/>
         </w:rPr>
-        <w:t>Other Matters</w:t>
-      </w:r>
-      <w:r>
-        <w:rPr>
-          <w:rFonts w:ascii="Times New Roman" w:eastAsia="Times New Roman" w:hAnsi="Times New Roman" w:cs="Times New Roman"/>
-          <w:kern w:val="0"/>
-          <w:sz w:val="28"/>
-          <w:szCs w:val="28"/>
-          <w:lang w:val="en-US"/>
-          <w14:ligatures w14:val="none"/>
-        </w:rPr>
-        <w:t xml:space="preserve"> (Board Chairman’s Time)</w:t>
+        <w:t>Board Chairman’s Time</w:t>
       </w:r>
     </w:p>
     <w:p>
@@ -3061,24 +2518,10 @@
           <w:rFonts w:ascii="Times New Roman" w:hAnsi="Times New Roman" w:cs="Times New Roman"/>
         </w:rPr>
       </w:pPr>
-    </w:p>
-    <w:p>
-      <w:pPr>
+      <w:r>
         <w:rPr>
           <w:rFonts w:ascii="Times New Roman" w:hAnsi="Times New Roman" w:cs="Times New Roman"/>
         </w:rPr>
-      </w:pPr>
-    </w:p>
-    <w:p>
-      <w:pPr>
-        <w:rPr>
-          <w:rFonts w:ascii="Times New Roman" w:hAnsi="Times New Roman" w:cs="Times New Roman"/>
-        </w:rPr>
-      </w:pPr>
-      <w:r>
-        <w:rPr>
-          <w:rFonts w:ascii="Times New Roman" w:hAnsi="Times New Roman" w:cs="Times New Roman"/>
-        </w:rPr>
         <w:br w:type="page"/>
       </w:r>
     </w:p>
@@ -3103,6 +2546,7 @@
           <w:lang w:val="en-US"/>
           <w14:ligatures w14:val="none"/>
         </w:rPr>
+        <w:lastRenderedPageBreak/>
         <w:t>May 14, 2026</w:t>
       </w:r>
     </w:p>
@@ -3150,7 +2594,27 @@
           <w:sz w:val="28"/>
           <w:szCs w:val="28"/>
         </w:rPr>
-        <w:t>Ms. ALYSSA MARIE L. MIJARES</w:t>
+        <w:t xml:space="preserve">Sec. </w:t>
+      </w:r>
+      <w:proofErr w:type="spellStart"/>
+      <w:r>
+        <w:rPr>
+          <w:rFonts w:ascii="Times New Roman" w:hAnsi="Times New Roman" w:cs="Times New Roman"/>
+          <w:b/>
+          <w:sz w:val="28"/>
+          <w:szCs w:val="28"/>
+        </w:rPr>
+        <w:t>Proceso</w:t>
+      </w:r>
+      <w:proofErr w:type="spellEnd"/>
+      <w:r>
+        <w:rPr>
+          <w:rFonts w:ascii="Times New Roman" w:hAnsi="Times New Roman" w:cs="Times New Roman"/>
+          <w:b/>
+          <w:sz w:val="28"/>
+          <w:szCs w:val="28"/>
+        </w:rPr>
+        <w:t xml:space="preserve"> J. Alcala</w:t>
       </w:r>
     </w:p>
     <w:p>
@@ -3170,7 +2634,7 @@
           <w:sz w:val="28"/>
           <w:szCs w:val="28"/>
         </w:rPr>
-        <w:t>Secretary to the Board</w:t>
+        <w:t>Member</w:t>
       </w:r>
     </w:p>
     <w:p>
@@ -3201,27 +2665,7 @@
           <w:sz w:val="28"/>
           <w:szCs w:val="28"/>
         </w:rPr>
-        <w:t xml:space="preserve">Dear Ms. </w:t>
-      </w:r>
-      <w:proofErr w:type="spellStart"/>
-      <w:r>
-        <w:rPr>
-          <w:rFonts w:ascii="Times New Roman" w:hAnsi="Times New Roman" w:cs="Times New Roman"/>
-          <w:b/>
-          <w:sz w:val="28"/>
-          <w:szCs w:val="28"/>
-        </w:rPr>
-        <w:t>Mijares</w:t>
-      </w:r>
-      <w:proofErr w:type="spellEnd"/>
-      <w:r>
-        <w:rPr>
-          <w:rFonts w:ascii="Times New Roman" w:hAnsi="Times New Roman" w:cs="Times New Roman"/>
-          <w:b/>
-          <w:sz w:val="28"/>
-          <w:szCs w:val="28"/>
-        </w:rPr>
-        <w:t>:</w:t>
+        <w:t>Dear Sec. Alcala:</w:t>
       </w:r>
     </w:p>
     <w:p>
@@ -3541,7 +2985,29 @@
           <w:lang w:val="en-US"/>
           <w14:ligatures w14:val="none"/>
         </w:rPr>
-        <w:t>Budget for Commencement Rights 2026</w:t>
+        <w:t xml:space="preserve">Budget for Commencement </w:t>
+      </w:r>
+      <w:r>
+        <w:rPr>
+          <w:rFonts w:ascii="Times New Roman" w:eastAsia="Times New Roman" w:hAnsi="Times New Roman" w:cs="Times New Roman"/>
+          <w:kern w:val="0"/>
+          <w:sz w:val="28"/>
+          <w:szCs w:val="28"/>
+          <w:lang w:val="en-US"/>
+          <w14:ligatures w14:val="none"/>
+        </w:rPr>
+        <w:t>Rites</w:t>
+      </w:r>
+      <w:r>
+        <w:rPr>
+          <w:rFonts w:ascii="Times New Roman" w:eastAsia="Times New Roman" w:hAnsi="Times New Roman" w:cs="Times New Roman"/>
+          <w:kern w:val="0"/>
+          <w:sz w:val="28"/>
+          <w:szCs w:val="28"/>
+          <w:lang w:val="en-US"/>
+          <w14:ligatures w14:val="none"/>
+        </w:rPr>
+        <w:t xml:space="preserve"> 2026</w:t>
       </w:r>
     </w:p>
     <w:p>
@@ -3580,7 +3046,35 @@
           <w:lang w:val="en-US"/>
           <w14:ligatures w14:val="none"/>
         </w:rPr>
-        <w:t xml:space="preserve"> (Board Chairman’s Time)</w:t>
+        <w:t xml:space="preserve"> </w:t>
+      </w:r>
+    </w:p>
+    <w:p>
+      <w:pPr>
+        <w:numPr>
+          <w:ilvl w:val="0"/>
+          <w:numId w:val="2"/>
+        </w:numPr>
+        <w:spacing w:after="0" w:line="240" w:lineRule="auto"/>
+        <w:rPr>
+          <w:rFonts w:ascii="Times New Roman" w:eastAsia="Times New Roman" w:hAnsi="Times New Roman" w:cs="Times New Roman"/>
+          <w:kern w:val="0"/>
+          <w:sz w:val="28"/>
+          <w:szCs w:val="28"/>
+          <w:lang w:val="en-US"/>
+          <w14:ligatures w14:val="none"/>
+        </w:rPr>
+      </w:pPr>
+      <w:r>
+        <w:rPr>
+          <w:rFonts w:ascii="Times New Roman" w:eastAsia="Times New Roman" w:hAnsi="Times New Roman" w:cs="Times New Roman"/>
+          <w:kern w:val="0"/>
+          <w:sz w:val="28"/>
+          <w:szCs w:val="28"/>
+          <w:lang w:val="en-US"/>
+          <w14:ligatures w14:val="none"/>
+        </w:rPr>
+        <w:t>Board Chairman’s Time</w:t>
       </w:r>
     </w:p>
     <w:p>
@@ -3720,6 +3214,788 @@
           <w14:ligatures w14:val="none"/>
         </w:rPr>
         <w:t xml:space="preserve">Hon. MARK DON VICTOR B. ALCALA </w:t>
+      </w:r>
+    </w:p>
+    <w:p>
+      <w:pPr>
+        <w:spacing w:after="0" w:line="240" w:lineRule="auto"/>
+        <w:rPr>
+          <w:rFonts w:ascii="Times New Roman" w:eastAsia="Times New Roman" w:hAnsi="Times New Roman" w:cs="Times New Roman"/>
+          <w:kern w:val="0"/>
+          <w:sz w:val="28"/>
+          <w:szCs w:val="28"/>
+          <w:lang w:val="en-US"/>
+          <w14:ligatures w14:val="none"/>
+        </w:rPr>
+      </w:pPr>
+      <w:r>
+        <w:rPr>
+          <w:rFonts w:ascii="Times New Roman" w:eastAsia="Times New Roman" w:hAnsi="Times New Roman" w:cs="Times New Roman"/>
+          <w:kern w:val="0"/>
+          <w:sz w:val="28"/>
+          <w:szCs w:val="28"/>
+          <w:lang w:val="en-US"/>
+          <w14:ligatures w14:val="none"/>
+        </w:rPr>
+        <w:t>Chairman, Board of Trustees</w:t>
+      </w:r>
+    </w:p>
+    <w:p>
+      <w:pPr>
+        <w:rPr>
+          <w:rFonts w:ascii="Times New Roman" w:hAnsi="Times New Roman" w:cs="Times New Roman"/>
+        </w:rPr>
+      </w:pPr>
+    </w:p>
+    <w:p>
+      <w:pPr>
+        <w:rPr>
+          <w:rFonts w:ascii="Times New Roman" w:hAnsi="Times New Roman" w:cs="Times New Roman"/>
+        </w:rPr>
+      </w:pPr>
+    </w:p>
+    <w:p>
+      <w:pPr>
+        <w:rPr>
+          <w:rFonts w:ascii="Times New Roman" w:hAnsi="Times New Roman" w:cs="Times New Roman"/>
+        </w:rPr>
+      </w:pPr>
+    </w:p>
+    <w:p>
+      <w:pPr>
+        <w:rPr>
+          <w:rFonts w:ascii="Times New Roman" w:hAnsi="Times New Roman" w:cs="Times New Roman"/>
+        </w:rPr>
+      </w:pPr>
+    </w:p>
+    <w:p>
+      <w:pPr>
+        <w:rPr>
+          <w:rFonts w:ascii="Times New Roman" w:hAnsi="Times New Roman" w:cs="Times New Roman"/>
+        </w:rPr>
+      </w:pPr>
+      <w:r>
+        <w:rPr>
+          <w:rFonts w:ascii="Times New Roman" w:hAnsi="Times New Roman" w:cs="Times New Roman"/>
+        </w:rPr>
+        <w:br w:type="page"/>
+      </w:r>
+    </w:p>
+    <w:p>
+      <w:pPr>
+        <w:spacing w:after="0" w:line="240" w:lineRule="auto"/>
+        <w:rPr>
+          <w:rFonts w:ascii="Times New Roman" w:eastAsia="Times New Roman" w:hAnsi="Times New Roman" w:cs="Times New Roman"/>
+          <w:kern w:val="0"/>
+          <w:sz w:val="28"/>
+          <w:szCs w:val="28"/>
+          <w:lang w:val="en-US"/>
+          <w14:ligatures w14:val="none"/>
+        </w:rPr>
+      </w:pPr>
+      <w:r>
+        <w:rPr>
+          <w:rFonts w:ascii="Times New Roman" w:eastAsia="Times New Roman" w:hAnsi="Times New Roman" w:cs="Times New Roman"/>
+          <w:kern w:val="0"/>
+          <w:sz w:val="28"/>
+          <w:szCs w:val="28"/>
+          <w:lang w:val="en-US"/>
+          <w14:ligatures w14:val="none"/>
+        </w:rPr>
+        <w:lastRenderedPageBreak/>
+        <w:t>May 14, 2026</w:t>
+      </w:r>
+    </w:p>
+    <w:p>
+      <w:pPr>
+        <w:tabs>
+          <w:tab w:val="left" w:pos="1440"/>
+        </w:tabs>
+        <w:spacing w:after="0" w:line="240" w:lineRule="auto"/>
+        <w:rPr>
+          <w:rFonts w:ascii="Times New Roman" w:eastAsia="Times New Roman" w:hAnsi="Times New Roman" w:cs="Times New Roman"/>
+          <w:kern w:val="0"/>
+          <w:sz w:val="28"/>
+          <w:szCs w:val="28"/>
+          <w:lang w:val="en-US"/>
+          <w14:ligatures w14:val="none"/>
+        </w:rPr>
+      </w:pPr>
+      <w:r>
+        <w:rPr>
+          <w:rFonts w:ascii="Times New Roman" w:eastAsia="Times New Roman" w:hAnsi="Times New Roman" w:cs="Times New Roman"/>
+          <w:kern w:val="0"/>
+          <w:sz w:val="28"/>
+          <w:szCs w:val="28"/>
+          <w:lang w:val="en-US"/>
+          <w14:ligatures w14:val="none"/>
+        </w:rPr>
+        <w:tab/>
+      </w:r>
+    </w:p>
+    <w:p>
+      <w:pPr>
+        <w:spacing w:after="0" w:line="240" w:lineRule="auto"/>
+        <w:rPr>
+          <w:rFonts w:ascii="Times New Roman" w:hAnsi="Times New Roman" w:cs="Times New Roman"/>
+          <w:b/>
+          <w:sz w:val="28"/>
+          <w:szCs w:val="28"/>
+        </w:rPr>
+      </w:pPr>
+      <w:r>
+        <w:rPr>
+          <w:rFonts w:ascii="Times New Roman" w:hAnsi="Times New Roman" w:cs="Times New Roman"/>
+          <w:b/>
+          <w:sz w:val="28"/>
+          <w:szCs w:val="28"/>
+        </w:rPr>
+        <w:t>Ms. ALYSSA MARIE L. MIJARES</w:t>
+      </w:r>
+    </w:p>
+    <w:p>
+      <w:pPr>
+        <w:spacing w:after="0" w:line="240" w:lineRule="auto"/>
+        <w:rPr>
+          <w:rFonts w:ascii="Times New Roman" w:hAnsi="Times New Roman" w:cs="Times New Roman"/>
+          <w:bCs/>
+          <w:sz w:val="28"/>
+          <w:szCs w:val="28"/>
+        </w:rPr>
+      </w:pPr>
+      <w:r>
+        <w:rPr>
+          <w:rFonts w:ascii="Times New Roman" w:hAnsi="Times New Roman" w:cs="Times New Roman"/>
+          <w:bCs/>
+          <w:sz w:val="28"/>
+          <w:szCs w:val="28"/>
+        </w:rPr>
+        <w:t>Secretary to the Board</w:t>
+      </w:r>
+    </w:p>
+    <w:p>
+      <w:pPr>
+        <w:spacing w:after="0" w:line="240" w:lineRule="auto"/>
+        <w:rPr>
+          <w:rFonts w:ascii="Times New Roman" w:hAnsi="Times New Roman" w:cs="Times New Roman"/>
+          <w:b/>
+          <w:sz w:val="28"/>
+          <w:szCs w:val="28"/>
+        </w:rPr>
+      </w:pPr>
+    </w:p>
+    <w:p>
+      <w:pPr>
+        <w:spacing w:after="0" w:line="240" w:lineRule="auto"/>
+        <w:rPr>
+          <w:rFonts w:ascii="Times New Roman" w:hAnsi="Times New Roman" w:cs="Times New Roman"/>
+          <w:b/>
+          <w:sz w:val="28"/>
+          <w:szCs w:val="28"/>
+        </w:rPr>
+      </w:pPr>
+      <w:r>
+        <w:rPr>
+          <w:rFonts w:ascii="Times New Roman" w:hAnsi="Times New Roman" w:cs="Times New Roman"/>
+          <w:b/>
+          <w:sz w:val="28"/>
+          <w:szCs w:val="28"/>
+        </w:rPr>
+        <w:t xml:space="preserve">Dear Ms. </w:t>
+      </w:r>
+      <w:proofErr w:type="spellStart"/>
+      <w:r>
+        <w:rPr>
+          <w:rFonts w:ascii="Times New Roman" w:hAnsi="Times New Roman" w:cs="Times New Roman"/>
+          <w:b/>
+          <w:sz w:val="28"/>
+          <w:szCs w:val="28"/>
+        </w:rPr>
+        <w:t>Mijares</w:t>
+      </w:r>
+      <w:proofErr w:type="spellEnd"/>
+      <w:r>
+        <w:rPr>
+          <w:rFonts w:ascii="Times New Roman" w:hAnsi="Times New Roman" w:cs="Times New Roman"/>
+          <w:b/>
+          <w:sz w:val="28"/>
+          <w:szCs w:val="28"/>
+        </w:rPr>
+        <w:t>:</w:t>
+      </w:r>
+    </w:p>
+    <w:p>
+      <w:pPr>
+        <w:spacing w:after="0" w:line="240" w:lineRule="auto"/>
+        <w:rPr>
+          <w:rFonts w:ascii="Times New Roman" w:eastAsia="Times New Roman" w:hAnsi="Times New Roman" w:cs="Times New Roman"/>
+          <w:kern w:val="0"/>
+          <w:sz w:val="28"/>
+          <w:szCs w:val="28"/>
+          <w:lang w:val="en-US"/>
+          <w14:ligatures w14:val="none"/>
+        </w:rPr>
+      </w:pPr>
+    </w:p>
+    <w:p>
+      <w:pPr>
+        <w:spacing w:after="0" w:line="240" w:lineRule="auto"/>
+        <w:jc w:val="both"/>
+        <w:rPr>
+          <w:rFonts w:ascii="Times New Roman" w:eastAsia="Times New Roman" w:hAnsi="Times New Roman" w:cs="Times New Roman"/>
+          <w:b/>
+          <w:kern w:val="0"/>
+          <w:sz w:val="28"/>
+          <w:szCs w:val="28"/>
+          <w:lang w:val="en-US"/>
+          <w14:ligatures w14:val="none"/>
+        </w:rPr>
+      </w:pPr>
+      <w:r>
+        <w:rPr>
+          <w:rFonts w:ascii="Times New Roman" w:eastAsia="Times New Roman" w:hAnsi="Times New Roman" w:cs="Times New Roman"/>
+          <w:kern w:val="0"/>
+          <w:sz w:val="28"/>
+          <w:szCs w:val="28"/>
+          <w:lang w:val="en-US"/>
+          <w14:ligatures w14:val="none"/>
+        </w:rPr>
+        <w:t xml:space="preserve">Please be informed that the meeting of the Board of Trustees of the </w:t>
+      </w:r>
+      <w:proofErr w:type="spellStart"/>
+      <w:r>
+        <w:rPr>
+          <w:rFonts w:ascii="Times New Roman" w:eastAsia="Times New Roman" w:hAnsi="Times New Roman" w:cs="Times New Roman"/>
+          <w:kern w:val="0"/>
+          <w:sz w:val="28"/>
+          <w:szCs w:val="28"/>
+          <w:lang w:val="en-US"/>
+          <w14:ligatures w14:val="none"/>
+        </w:rPr>
+        <w:t>Dalubhasaan</w:t>
+      </w:r>
+      <w:proofErr w:type="spellEnd"/>
+      <w:r>
+        <w:rPr>
+          <w:rFonts w:ascii="Times New Roman" w:eastAsia="Times New Roman" w:hAnsi="Times New Roman" w:cs="Times New Roman"/>
+          <w:kern w:val="0"/>
+          <w:sz w:val="28"/>
+          <w:szCs w:val="28"/>
+          <w:lang w:val="en-US"/>
+          <w14:ligatures w14:val="none"/>
+        </w:rPr>
+        <w:t xml:space="preserve"> ng </w:t>
+      </w:r>
+      <w:proofErr w:type="spellStart"/>
+      <w:r>
+        <w:rPr>
+          <w:rFonts w:ascii="Times New Roman" w:eastAsia="Times New Roman" w:hAnsi="Times New Roman" w:cs="Times New Roman"/>
+          <w:kern w:val="0"/>
+          <w:sz w:val="28"/>
+          <w:szCs w:val="28"/>
+          <w:lang w:val="en-US"/>
+          <w14:ligatures w14:val="none"/>
+        </w:rPr>
+        <w:t>Lungsod</w:t>
+      </w:r>
+      <w:proofErr w:type="spellEnd"/>
+      <w:r>
+        <w:rPr>
+          <w:rFonts w:ascii="Times New Roman" w:eastAsia="Times New Roman" w:hAnsi="Times New Roman" w:cs="Times New Roman"/>
+          <w:kern w:val="0"/>
+          <w:sz w:val="28"/>
+          <w:szCs w:val="28"/>
+          <w:lang w:val="en-US"/>
+          <w14:ligatures w14:val="none"/>
+        </w:rPr>
+        <w:t xml:space="preserve"> ng </w:t>
+      </w:r>
+      <w:proofErr w:type="spellStart"/>
+      <w:r>
+        <w:rPr>
+          <w:rFonts w:ascii="Times New Roman" w:eastAsia="Times New Roman" w:hAnsi="Times New Roman" w:cs="Times New Roman"/>
+          <w:kern w:val="0"/>
+          <w:sz w:val="28"/>
+          <w:szCs w:val="28"/>
+          <w:lang w:val="en-US"/>
+          <w14:ligatures w14:val="none"/>
+        </w:rPr>
+        <w:t>Lucena</w:t>
+      </w:r>
+      <w:proofErr w:type="spellEnd"/>
+      <w:r>
+        <w:rPr>
+          <w:rFonts w:ascii="Times New Roman" w:eastAsia="Times New Roman" w:hAnsi="Times New Roman" w:cs="Times New Roman"/>
+          <w:kern w:val="0"/>
+          <w:sz w:val="28"/>
+          <w:szCs w:val="28"/>
+          <w:lang w:val="en-US"/>
+          <w14:ligatures w14:val="none"/>
+        </w:rPr>
+        <w:t xml:space="preserve"> is set on </w:t>
+      </w:r>
+      <w:r>
+        <w:rPr>
+          <w:rFonts w:ascii="Times New Roman" w:eastAsia="Times New Roman" w:hAnsi="Times New Roman" w:cs="Times New Roman"/>
+          <w:b/>
+          <w:bCs/>
+          <w:kern w:val="0"/>
+          <w:sz w:val="28"/>
+          <w:szCs w:val="28"/>
+          <w:lang w:val="en-US"/>
+          <w14:ligatures w14:val="none"/>
+        </w:rPr>
+        <w:t>Tuesday</w:t>
+      </w:r>
+      <w:r>
+        <w:rPr>
+          <w:rFonts w:ascii="Times New Roman" w:eastAsia="Times New Roman" w:hAnsi="Times New Roman" w:cs="Times New Roman"/>
+          <w:b/>
+          <w:kern w:val="0"/>
+          <w:sz w:val="28"/>
+          <w:szCs w:val="28"/>
+          <w:lang w:val="en-US"/>
+          <w14:ligatures w14:val="none"/>
+        </w:rPr>
+        <w:t xml:space="preserve">, May 19, 2026, 10:30 in the morning at the President’s Office at the </w:t>
+      </w:r>
+      <w:proofErr w:type="spellStart"/>
+      <w:r>
+        <w:rPr>
+          <w:rFonts w:ascii="Times New Roman" w:eastAsia="Times New Roman" w:hAnsi="Times New Roman" w:cs="Times New Roman"/>
+          <w:b/>
+          <w:kern w:val="0"/>
+          <w:sz w:val="28"/>
+          <w:szCs w:val="28"/>
+          <w:lang w:val="en-US"/>
+          <w14:ligatures w14:val="none"/>
+        </w:rPr>
+        <w:t>Dalubhasaan</w:t>
+      </w:r>
+      <w:proofErr w:type="spellEnd"/>
+      <w:r>
+        <w:rPr>
+          <w:rFonts w:ascii="Times New Roman" w:eastAsia="Times New Roman" w:hAnsi="Times New Roman" w:cs="Times New Roman"/>
+          <w:b/>
+          <w:kern w:val="0"/>
+          <w:sz w:val="28"/>
+          <w:szCs w:val="28"/>
+          <w:lang w:val="en-US"/>
+          <w14:ligatures w14:val="none"/>
+        </w:rPr>
+        <w:t xml:space="preserve"> ng </w:t>
+      </w:r>
+      <w:proofErr w:type="spellStart"/>
+      <w:r>
+        <w:rPr>
+          <w:rFonts w:ascii="Times New Roman" w:eastAsia="Times New Roman" w:hAnsi="Times New Roman" w:cs="Times New Roman"/>
+          <w:b/>
+          <w:kern w:val="0"/>
+          <w:sz w:val="28"/>
+          <w:szCs w:val="28"/>
+          <w:lang w:val="en-US"/>
+          <w14:ligatures w14:val="none"/>
+        </w:rPr>
+        <w:t>Lungsod</w:t>
+      </w:r>
+      <w:proofErr w:type="spellEnd"/>
+      <w:r>
+        <w:rPr>
+          <w:rFonts w:ascii="Times New Roman" w:eastAsia="Times New Roman" w:hAnsi="Times New Roman" w:cs="Times New Roman"/>
+          <w:b/>
+          <w:kern w:val="0"/>
+          <w:sz w:val="28"/>
+          <w:szCs w:val="28"/>
+          <w:lang w:val="en-US"/>
+          <w14:ligatures w14:val="none"/>
+        </w:rPr>
+        <w:t xml:space="preserve"> ng </w:t>
+      </w:r>
+      <w:proofErr w:type="spellStart"/>
+      <w:r>
+        <w:rPr>
+          <w:rFonts w:ascii="Times New Roman" w:eastAsia="Times New Roman" w:hAnsi="Times New Roman" w:cs="Times New Roman"/>
+          <w:b/>
+          <w:kern w:val="0"/>
+          <w:sz w:val="28"/>
+          <w:szCs w:val="28"/>
+          <w:lang w:val="en-US"/>
+          <w14:ligatures w14:val="none"/>
+        </w:rPr>
+        <w:t>Lucena</w:t>
+      </w:r>
+      <w:proofErr w:type="spellEnd"/>
+      <w:r>
+        <w:rPr>
+          <w:rFonts w:ascii="Times New Roman" w:eastAsia="Times New Roman" w:hAnsi="Times New Roman" w:cs="Times New Roman"/>
+          <w:b/>
+          <w:kern w:val="0"/>
+          <w:sz w:val="28"/>
+          <w:szCs w:val="28"/>
+          <w:lang w:val="en-US"/>
+          <w14:ligatures w14:val="none"/>
+        </w:rPr>
+        <w:t xml:space="preserve"> Administration Office. </w:t>
+      </w:r>
+    </w:p>
+    <w:p>
+      <w:pPr>
+        <w:spacing w:after="0" w:line="240" w:lineRule="auto"/>
+        <w:rPr>
+          <w:rFonts w:ascii="Times New Roman" w:eastAsia="Times New Roman" w:hAnsi="Times New Roman" w:cs="Times New Roman"/>
+          <w:kern w:val="0"/>
+          <w:sz w:val="28"/>
+          <w:szCs w:val="28"/>
+          <w:lang w:val="en-US"/>
+          <w14:ligatures w14:val="none"/>
+        </w:rPr>
+      </w:pPr>
+    </w:p>
+    <w:p>
+      <w:pPr>
+        <w:spacing w:after="0" w:line="240" w:lineRule="auto"/>
+        <w:rPr>
+          <w:rFonts w:ascii="Times New Roman" w:eastAsia="Times New Roman" w:hAnsi="Times New Roman" w:cs="Times New Roman"/>
+          <w:kern w:val="0"/>
+          <w:sz w:val="28"/>
+          <w:szCs w:val="28"/>
+          <w:lang w:val="en-US"/>
+          <w14:ligatures w14:val="none"/>
+        </w:rPr>
+      </w:pPr>
+      <w:r>
+        <w:rPr>
+          <w:rFonts w:ascii="Times New Roman" w:eastAsia="Times New Roman" w:hAnsi="Times New Roman" w:cs="Times New Roman"/>
+          <w:kern w:val="0"/>
+          <w:sz w:val="28"/>
+          <w:szCs w:val="28"/>
+          <w:lang w:val="en-US"/>
+          <w14:ligatures w14:val="none"/>
+        </w:rPr>
+        <w:t>Important matters to be discussed on the said meeting are the following:</w:t>
+      </w:r>
+    </w:p>
+    <w:p>
+      <w:pPr>
+        <w:spacing w:after="0" w:line="240" w:lineRule="auto"/>
+        <w:rPr>
+          <w:rFonts w:ascii="Times New Roman" w:eastAsia="Times New Roman" w:hAnsi="Times New Roman" w:cs="Times New Roman"/>
+          <w:kern w:val="0"/>
+          <w:sz w:val="28"/>
+          <w:szCs w:val="28"/>
+          <w:lang w:val="en-US"/>
+          <w14:ligatures w14:val="none"/>
+        </w:rPr>
+      </w:pPr>
+    </w:p>
+    <w:p>
+      <w:pPr>
+        <w:numPr>
+          <w:ilvl w:val="0"/>
+          <w:numId w:val="2"/>
+        </w:numPr>
+        <w:spacing w:after="0" w:line="240" w:lineRule="auto"/>
+        <w:rPr>
+          <w:rFonts w:ascii="Times New Roman" w:eastAsia="Times New Roman" w:hAnsi="Times New Roman" w:cs="Times New Roman"/>
+          <w:kern w:val="0"/>
+          <w:sz w:val="28"/>
+          <w:szCs w:val="28"/>
+          <w:lang w:val="en-US"/>
+          <w14:ligatures w14:val="none"/>
+        </w:rPr>
+      </w:pPr>
+      <w:r>
+        <w:rPr>
+          <w:rFonts w:ascii="Times New Roman" w:eastAsia="Times New Roman" w:hAnsi="Times New Roman" w:cs="Times New Roman"/>
+          <w:kern w:val="0"/>
+          <w:sz w:val="28"/>
+          <w:szCs w:val="28"/>
+          <w:lang w:val="en-US"/>
+          <w14:ligatures w14:val="none"/>
+        </w:rPr>
+        <w:t>Deliberation and Conferment of Graduating Students</w:t>
+      </w:r>
+    </w:p>
+    <w:p>
+      <w:pPr>
+        <w:numPr>
+          <w:ilvl w:val="0"/>
+          <w:numId w:val="2"/>
+        </w:numPr>
+        <w:spacing w:after="0" w:line="240" w:lineRule="auto"/>
+        <w:rPr>
+          <w:rFonts w:ascii="Times New Roman" w:eastAsia="Times New Roman" w:hAnsi="Times New Roman" w:cs="Times New Roman"/>
+          <w:kern w:val="0"/>
+          <w:sz w:val="28"/>
+          <w:szCs w:val="28"/>
+          <w:lang w:val="en-US"/>
+          <w14:ligatures w14:val="none"/>
+        </w:rPr>
+      </w:pPr>
+      <w:r>
+        <w:rPr>
+          <w:rFonts w:ascii="Times New Roman" w:eastAsia="Times New Roman" w:hAnsi="Times New Roman" w:cs="Times New Roman"/>
+          <w:kern w:val="0"/>
+          <w:sz w:val="28"/>
+          <w:szCs w:val="28"/>
+          <w:lang w:val="en-US"/>
+          <w14:ligatures w14:val="none"/>
+        </w:rPr>
+        <w:t xml:space="preserve">Budget for Commencement </w:t>
+      </w:r>
+      <w:r>
+        <w:rPr>
+          <w:rFonts w:ascii="Times New Roman" w:eastAsia="Times New Roman" w:hAnsi="Times New Roman" w:cs="Times New Roman"/>
+          <w:kern w:val="0"/>
+          <w:sz w:val="28"/>
+          <w:szCs w:val="28"/>
+          <w:lang w:val="en-US"/>
+          <w14:ligatures w14:val="none"/>
+        </w:rPr>
+        <w:t>Rites</w:t>
+      </w:r>
+      <w:r>
+        <w:rPr>
+          <w:rFonts w:ascii="Times New Roman" w:eastAsia="Times New Roman" w:hAnsi="Times New Roman" w:cs="Times New Roman"/>
+          <w:kern w:val="0"/>
+          <w:sz w:val="28"/>
+          <w:szCs w:val="28"/>
+          <w:lang w:val="en-US"/>
+          <w14:ligatures w14:val="none"/>
+        </w:rPr>
+        <w:t xml:space="preserve"> 2026</w:t>
+      </w:r>
+    </w:p>
+    <w:p>
+      <w:pPr>
+        <w:numPr>
+          <w:ilvl w:val="0"/>
+          <w:numId w:val="2"/>
+        </w:numPr>
+        <w:spacing w:after="0" w:line="240" w:lineRule="auto"/>
+        <w:rPr>
+          <w:rFonts w:ascii="Times New Roman" w:eastAsia="Times New Roman" w:hAnsi="Times New Roman" w:cs="Times New Roman"/>
+          <w:kern w:val="0"/>
+          <w:sz w:val="28"/>
+          <w:szCs w:val="28"/>
+          <w:lang w:val="en-US"/>
+          <w14:ligatures w14:val="none"/>
+        </w:rPr>
+      </w:pPr>
+      <w:r>
+        <w:rPr>
+          <w:rFonts w:ascii="Times New Roman" w:eastAsia="Times New Roman" w:hAnsi="Times New Roman" w:cs="Times New Roman"/>
+          <w:kern w:val="0"/>
+          <w:sz w:val="28"/>
+          <w:szCs w:val="28"/>
+          <w:lang w:val="en-US"/>
+          <w14:ligatures w14:val="none"/>
+        </w:rPr>
+        <w:t>Other Matters</w:t>
+      </w:r>
+      <w:r>
+        <w:rPr>
+          <w:rFonts w:ascii="Times New Roman" w:eastAsia="Times New Roman" w:hAnsi="Times New Roman" w:cs="Times New Roman"/>
+          <w:kern w:val="0"/>
+          <w:sz w:val="28"/>
+          <w:szCs w:val="28"/>
+          <w:lang w:val="en-US"/>
+          <w14:ligatures w14:val="none"/>
+        </w:rPr>
+        <w:t xml:space="preserve"> </w:t>
+      </w:r>
+    </w:p>
+    <w:p>
+      <w:pPr>
+        <w:numPr>
+          <w:ilvl w:val="0"/>
+          <w:numId w:val="2"/>
+        </w:numPr>
+        <w:spacing w:after="0" w:line="240" w:lineRule="auto"/>
+        <w:rPr>
+          <w:rFonts w:ascii="Times New Roman" w:eastAsia="Times New Roman" w:hAnsi="Times New Roman" w:cs="Times New Roman"/>
+          <w:kern w:val="0"/>
+          <w:sz w:val="28"/>
+          <w:szCs w:val="28"/>
+          <w:lang w:val="en-US"/>
+          <w14:ligatures w14:val="none"/>
+        </w:rPr>
+      </w:pPr>
+      <w:r>
+        <w:rPr>
+          <w:rFonts w:ascii="Times New Roman" w:eastAsia="Times New Roman" w:hAnsi="Times New Roman" w:cs="Times New Roman"/>
+          <w:kern w:val="0"/>
+          <w:sz w:val="28"/>
+          <w:szCs w:val="28"/>
+          <w:lang w:val="en-US"/>
+          <w14:ligatures w14:val="none"/>
+        </w:rPr>
+        <w:t>Board Chairman’s Time</w:t>
+      </w:r>
+    </w:p>
+    <w:p>
+      <w:pPr>
+        <w:spacing w:after="0" w:line="240" w:lineRule="auto"/>
+        <w:rPr>
+          <w:rFonts w:ascii="Times New Roman" w:eastAsia="Times New Roman" w:hAnsi="Times New Roman" w:cs="Times New Roman"/>
+          <w:kern w:val="0"/>
+          <w:sz w:val="28"/>
+          <w:szCs w:val="28"/>
+          <w:lang w:val="en-US"/>
+          <w14:ligatures w14:val="none"/>
+        </w:rPr>
+      </w:pPr>
+    </w:p>
+    <w:p>
+      <w:pPr>
+        <w:spacing w:after="0" w:line="240" w:lineRule="auto"/>
+        <w:rPr>
+          <w:rFonts w:ascii="Times New Roman" w:eastAsia="Times New Roman" w:hAnsi="Times New Roman" w:cs="Times New Roman"/>
+          <w:kern w:val="0"/>
+          <w:sz w:val="28"/>
+          <w:szCs w:val="28"/>
+          <w:lang w:val="en-US"/>
+          <w14:ligatures w14:val="none"/>
+        </w:rPr>
+      </w:pPr>
+      <w:r>
+        <w:rPr>
+          <w:rFonts w:ascii="Times New Roman" w:eastAsia="Times New Roman" w:hAnsi="Times New Roman" w:cs="Times New Roman"/>
+          <w:kern w:val="0"/>
+          <w:sz w:val="28"/>
+          <w:szCs w:val="28"/>
+          <w:lang w:val="en-US"/>
+          <w14:ligatures w14:val="none"/>
+        </w:rPr>
+        <w:t>We highly appreciate your personal presence in the said meeting. Thank you very much.</w:t>
+      </w:r>
+    </w:p>
+    <w:p>
+      <w:pPr>
+        <w:spacing w:after="0" w:line="240" w:lineRule="auto"/>
+        <w:rPr>
+          <w:rFonts w:ascii="Times New Roman" w:eastAsia="Times New Roman" w:hAnsi="Times New Roman" w:cs="Times New Roman"/>
+          <w:kern w:val="0"/>
+          <w:sz w:val="28"/>
+          <w:szCs w:val="28"/>
+          <w:lang w:val="en-US"/>
+          <w14:ligatures w14:val="none"/>
+        </w:rPr>
+      </w:pPr>
+    </w:p>
+    <w:p>
+      <w:pPr>
+        <w:spacing w:after="0" w:line="240" w:lineRule="auto"/>
+        <w:rPr>
+          <w:rFonts w:ascii="Times New Roman" w:eastAsia="Times New Roman" w:hAnsi="Times New Roman" w:cs="Times New Roman"/>
+          <w:kern w:val="0"/>
+          <w:sz w:val="28"/>
+          <w:szCs w:val="28"/>
+          <w:lang w:val="en-US"/>
+          <w14:ligatures w14:val="none"/>
+        </w:rPr>
+      </w:pPr>
+      <w:r>
+        <w:rPr>
+          <w:rFonts w:ascii="Times New Roman" w:eastAsia="Times New Roman" w:hAnsi="Times New Roman" w:cs="Times New Roman"/>
+          <w:kern w:val="0"/>
+          <w:sz w:val="28"/>
+          <w:szCs w:val="28"/>
+          <w:lang w:val="en-US"/>
+          <w14:ligatures w14:val="none"/>
+        </w:rPr>
+        <w:t>Very truly yours,</w:t>
+      </w:r>
+    </w:p>
+    <w:p>
+      <w:pPr>
+        <w:spacing w:after="0" w:line="240" w:lineRule="auto"/>
+        <w:rPr>
+          <w:rFonts w:ascii="Times New Roman" w:eastAsia="Times New Roman" w:hAnsi="Times New Roman" w:cs="Times New Roman"/>
+          <w:kern w:val="0"/>
+          <w:sz w:val="28"/>
+          <w:szCs w:val="28"/>
+          <w:lang w:val="en-US"/>
+          <w14:ligatures w14:val="none"/>
+        </w:rPr>
+      </w:pPr>
+    </w:p>
+    <w:p>
+      <w:pPr>
+        <w:spacing w:after="0" w:line="240" w:lineRule="auto"/>
+        <w:rPr>
+          <w:rFonts w:ascii="Times New Roman" w:eastAsia="Times New Roman" w:hAnsi="Times New Roman" w:cs="Times New Roman"/>
+          <w:kern w:val="0"/>
+          <w:sz w:val="28"/>
+          <w:szCs w:val="28"/>
+          <w:lang w:val="en-US"/>
+          <w14:ligatures w14:val="none"/>
+        </w:rPr>
+      </w:pPr>
+    </w:p>
+    <w:p>
+      <w:pPr>
+        <w:spacing w:after="0" w:line="240" w:lineRule="auto"/>
+        <w:rPr>
+          <w:rFonts w:ascii="Times New Roman" w:eastAsia="Times New Roman" w:hAnsi="Times New Roman" w:cs="Times New Roman"/>
+          <w:kern w:val="0"/>
+          <w:sz w:val="28"/>
+          <w:szCs w:val="28"/>
+          <w:lang w:val="en-US"/>
+          <w14:ligatures w14:val="none"/>
+        </w:rPr>
+      </w:pPr>
+    </w:p>
+    <w:p>
+      <w:pPr>
+        <w:spacing w:after="0" w:line="240" w:lineRule="auto"/>
+        <w:rPr>
+          <w:rFonts w:ascii="Times New Roman" w:eastAsia="Times New Roman" w:hAnsi="Times New Roman" w:cs="Times New Roman"/>
+          <w:b/>
+          <w:kern w:val="0"/>
+          <w:sz w:val="28"/>
+          <w:szCs w:val="28"/>
+          <w:lang w:val="en-US"/>
+          <w14:ligatures w14:val="none"/>
+        </w:rPr>
+      </w:pPr>
+      <w:r>
+        <w:rPr>
+          <w:rFonts w:ascii="Times New Roman" w:eastAsia="Times New Roman" w:hAnsi="Times New Roman" w:cs="Times New Roman"/>
+          <w:b/>
+          <w:kern w:val="0"/>
+          <w:sz w:val="28"/>
+          <w:szCs w:val="28"/>
+          <w:lang w:val="en-US"/>
+          <w14:ligatures w14:val="none"/>
+        </w:rPr>
+        <w:t>Hon. MARK DON VIC</w:t>
+      </w:r>
+      <w:r>
+        <w:rPr>
+          <w:rFonts w:ascii="Times New Roman" w:eastAsia="Times New Roman" w:hAnsi="Times New Roman" w:cs="Times New Roman"/>
+          <w:b/>
+          <w:kern w:val="0"/>
+          <w:sz w:val="28"/>
+          <w:szCs w:val="28"/>
+          <w:lang w:val="en-US"/>
+          <w14:ligatures w14:val="none"/>
+        </w:rPr>
+        <w:t>.3.</w:t>
+      </w:r>
+      <w:bookmarkStart w:id="0" w:name="_GoBack"/>
+      <w:bookmarkEnd w:id="0"/>
+      <w:r>
+        <w:rPr>
+          <w:rFonts w:ascii="Times New Roman" w:eastAsia="Times New Roman" w:hAnsi="Times New Roman" w:cs="Times New Roman"/>
+          <w:b/>
+          <w:kern w:val="0"/>
+          <w:sz w:val="28"/>
+          <w:szCs w:val="28"/>
+          <w:lang w:val="en-US"/>
+          <w14:ligatures w14:val="none"/>
+        </w:rPr>
+        <w:t xml:space="preserve">TOR B. ALCALA </w:t>
       </w:r>
     </w:p>
     <w:p>
@@ -4184,7 +4460,7 @@
             </wp:anchor>
           </w:drawing>
         </mc:Choice>
-        <mc:Fallback xmlns:w16sdtdh="http://schemas.microsoft.com/office/word/2020/wordml/sdtdatahash" xmlns:w16="http://schemas.microsoft.com/office/word/2018/wordml" xmlns:w16cid="http://schemas.microsoft.com/office/word/2016/wordml/cid" xmlns:w16cex="http://schemas.microsoft.com/office/word/2018/wordml/cex" xmlns:am3d="http://schemas.microsoft.com/office/drawing/2017/model3d" xmlns:aink="http://schemas.microsoft.com/office/drawing/2016/ink" xmlns:cx8="http://schemas.microsoft.com/office/drawing/2016/5/14/chartex" xmlns:cx7="http://schemas.microsoft.com/office/drawing/2016/5/13/chartex" xmlns:cx6="http://schemas.microsoft.com/office/drawing/2016/5/12/chartex" xmlns:cx5="http://schemas.microsoft.com/office/drawing/2016/5/11/chartex" xmlns:cx4="http://schemas.microsoft.com/office/drawing/2016/5/10/chartex" xmlns:cx3="http://schemas.microsoft.com/office/drawing/2016/5/9/chartex" xmlns:cx2="http://schemas.microsoft.com/office/drawing/2015/10/21/chartex" xmlns:cx1="http://schemas.microsoft.com/office/drawing/2015/9/8/chartex">
+        <mc:Fallback xmlns:cx1="http://schemas.microsoft.com/office/drawing/2015/9/8/chartex" xmlns:cx2="http://schemas.microsoft.com/office/drawing/2015/10/21/chartex" xmlns:cx3="http://schemas.microsoft.com/office/drawing/2016/5/9/chartex" xmlns:cx4="http://schemas.microsoft.com/office/drawing/2016/5/10/chartex" xmlns:cx5="http://schemas.microsoft.com/office/drawing/2016/5/11/chartex" xmlns:cx6="http://schemas.microsoft.com/office/drawing/2016/5/12/chartex" xmlns:cx7="http://schemas.microsoft.com/office/drawing/2016/5/13/chartex" xmlns:cx8="http://schemas.microsoft.com/office/drawing/2016/5/14/chartex" xmlns:aink="http://schemas.microsoft.com/office/drawing/2016/ink" xmlns:am3d="http://schemas.microsoft.com/office/drawing/2017/model3d" xmlns:w16cex="http://schemas.microsoft.com/office/word/2018/wordml/cex" xmlns:w16cid="http://schemas.microsoft.com/office/word/2016/wordml/cid" xmlns:w16="http://schemas.microsoft.com/office/word/2018/wordml" xmlns:w16sdtdh="http://schemas.microsoft.com/office/word/2020/wordml/sdtdatahash">
           <w:pict>
             <v:line w14:anchorId="1862DB43" id="Line 2" o:spid="_x0000_s1026" style="position:absolute;z-index:251659264;visibility:visible;mso-wrap-style:square;mso-wrap-distance-left:9pt;mso-wrap-distance-top:0;mso-wrap-distance-right:9pt;mso-wrap-distance-bottom:0;mso-position-horizontal:absolute;mso-position-horizontal-relative:text;mso-position-vertical:absolute;mso-position-vertical-relative:text" from="2.35pt,3.8pt" to="469.1pt,3.9pt" o:gfxdata="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" strokeweight="4.5pt">
               <v:stroke linestyle="thinThick"/>
@@ -4884,7 +5160,7 @@
   <w:style w:type="paragraph" w:default="1" w:styleId="Normal">
     <w:name w:val="Normal"/>
     <w:qFormat/>
-    <w:rsid w:val="00B66CC1"/>
+    <w:rsid w:val="005771CE"/>
   </w:style>
   <w:style w:type="paragraph" w:styleId="Heading1">
     <w:name w:val="heading 1"/>

</xml_diff>